<commit_message>
docs: corregir cifras de docentes, DTI y autoridades en DTI-IGA-2026-001
Verificacion contra Oracle LAMB (2026-05-21):

- Personal docente: 135 -> ~1.190 docentes universitarios reales.
  El "135" es solo la planta con categorizacion academica formal
  (ENOC.CAT_DOCENTE estado 02); el resto figura como employee-staff.
- Equipo DTI: ~10 -> 72 (id_area 18; Lima 38, Juliaca 23, Tarapoto 11).
- Autoridades academicas: ~40 -> 27 verificadas (5 decanos +
  13 directores de escuela profesional + 2 de filial + 7 de posgrado).

Se documenta el sesgo de clasificacion docente/administrativo del
resource Trabajadores como tarea pendiente (nota ** seccion 7.2,
KPI nuevo, proximos pasos 13.2).

Co-Authored-By: Claude Sonnet 4.6 <noreply@anthropic.com>
</commit_message>
<xml_diff>
--- a/docs/DTI-IGA-2026-001-Proyecto.docx
+++ b/docs/DTI-IGA-2026-001-Proyecto.docx
@@ -2039,7 +2039,7 @@
           <w:sz w:val="20"/>
           <w:szCs w:val="20"/>
         </w:rPr>
-        <w:t xml:space="preserve">La UPeU es una institucion de educacion superior adventista con presencia en tres campus: Lima (sede central), Juliaca (region andina) y Tarapoto (region amazonica). Su comunidad academica, verificada contra la base de datos institucional Oracle LAMB en mayo de 2026, comprende alrededor de 24.000 estudiantes con matricula vigente en el año academico 2026 (23.620 en el ciclo regular vigente), 30.635 egresados, 3.144 trabajadores administrativos y 135 docentes.</w:t>
+        <w:t xml:space="preserve">La UPeU es una institucion de educacion superior adventista con presencia en tres campus: Lima (sede central), Juliaca (region andina) y Tarapoto (region amazonica). Su comunidad academica, verificada contra la base de datos institucional Oracle LAMB en mayo de 2026, comprende alrededor de 24.000 estudiantes con matricula vigente en el año academico 2026 (23.620 en el ciclo regular vigente), 30.635 egresados y aproximadamente 3.800 trabajadores activos, de los cuales cerca de 1.190 son docentes universitarios y el resto personal administrativo y operativo.</w:t>
       </w:r>
     </w:p>
     <w:p>
@@ -6581,7 +6581,7 @@
                 <w:sz w:val="18"/>
                 <w:szCs w:val="18"/>
               </w:rPr>
-              <w:t xml:space="preserve">135</w:t>
+              <w:t xml:space="preserve">~1.190</w:t>
             </w:r>
           </w:p>
         </w:tc>
@@ -6616,7 +6616,7 @@
                 <w:sz w:val="18"/>
                 <w:szCs w:val="18"/>
               </w:rPr>
-              <w:t xml:space="preserve">Alta automatica al registrarse en LAMB. Licencia M365 A3 correcta por tipo de contrato (TC/TP). Acceso a bases cientificas via SSO SAML.</w:t>
+              <w:t xml:space="preserve">Alta automatica al registrarse en LAMB. Licencia M365 correcta por tipo de contrato (TC/TP). Acceso a bases cientificas via SSO SAML. Actualmente 135 clasificados como archetype faculty; el resto figura provisionalmente como staff (ver nota seccion 7.2).</w:t>
             </w:r>
           </w:p>
         </w:tc>
@@ -6902,7 +6902,7 @@
                 <w:sz w:val="18"/>
                 <w:szCs w:val="18"/>
               </w:rPr>
-              <w:t xml:space="preserve">~10</w:t>
+              <w:t xml:space="preserve">72</w:t>
             </w:r>
           </w:p>
         </w:tc>
@@ -6937,7 +6937,7 @@
                 <w:sz w:val="18"/>
                 <w:szCs w:val="18"/>
               </w:rPr>
-              <w:t xml:space="preserve">Eliminacion de tareas manuales repetitivas. Visibilidad completa de identidades. Evidencia para auditorias sin recoleccion adicional.</w:t>
+              <w:t xml:space="preserve">Eliminacion de tareas manuales repetitivas. Visibilidad completa de identidades. Evidencia para auditorias sin recoleccion adicional. Personal DTI distribuido en los tres campus (Lima 38, Juliaca 23, Tarapoto 11).</w:t>
             </w:r>
           </w:p>
         </w:tc>
@@ -7009,7 +7009,7 @@
                 <w:sz w:val="18"/>
                 <w:szCs w:val="18"/>
               </w:rPr>
-              <w:t xml:space="preserve">~40</w:t>
+              <w:t xml:space="preserve">27</w:t>
             </w:r>
           </w:p>
         </w:tc>
@@ -7044,7 +7044,7 @@
                 <w:sz w:val="18"/>
                 <w:szCs w:val="18"/>
               </w:rPr>
-              <w:t xml:space="preserve">Pueden delegar acceso a sistemas de sus unidades sin intervenir en la configuracion tecnica. Delegacion de administracion en Entra ID por AU (campus/sede).</w:t>
+              <w:t xml:space="preserve">Pueden delegar acceso a sistemas de sus unidades sin intervenir en la configuracion tecnica. Comprende 5 decanos de facultad, 13 directores de escuela profesional, 2 directores de filial y 7 directores de posgrado. Delegacion de administracion en Entra ID por AU (campus/sede).</w:t>
             </w:r>
           </w:p>
         </w:tc>
@@ -7697,7 +7697,7 @@
                 <w:sz w:val="18"/>
                 <w:szCs w:val="18"/>
               </w:rPr>
-              <w:t xml:space="preserve">employee-staff (personal administrativo)</w:t>
+              <w:t xml:space="preserve">employee-staff (personal administrativo) **</w:t>
             </w:r>
           </w:p>
         </w:tc>
@@ -7981,7 +7981,7 @@
                 <w:sz w:val="18"/>
                 <w:szCs w:val="18"/>
               </w:rPr>
-              <w:t xml:space="preserve">employee-faculty (docentes)</w:t>
+              <w:t xml:space="preserve">employee-faculty (docentes) **</w:t>
             </w:r>
           </w:p>
         </w:tc>
@@ -8251,6 +8251,25 @@
           <w:szCs w:val="18"/>
         </w:rPr>
         <w:t xml:space="preserve">* El archetype student refleja actualmente 1.679 usuarios correspondientes al ciclo Verano 2026. El resource Oracle LAMB Estudiantes esta configurado con el identificador de semestre fijo (ID_SEMESTRE = 279); la carga del padron del ciclo regular vigente — aproximadamente 23.620 estudiantes — requiere parametrizar dinamicamente el semestre y constituye una tarea pendiente priorizada del proyecto.</w:t>
+      </w:r>
+    </w:p>
+    <w:p>
+      <w:pPr>
+        <w:spacing w:after="80" w:before="40"/>
+        <w:jc w:val="left"/>
+      </w:pPr>
+      <w:r>
+        <w:rPr>
+          <w:rFonts w:ascii="Arial" w:cs="Arial" w:eastAsia="Arial" w:hAnsi="Arial"/>
+          <w:b w:val="false"/>
+          <w:bCs w:val="false"/>
+          <w:i/>
+          <w:iCs/>
+          <w:color w:val="6B7280"/>
+          <w:sz w:val="18"/>
+          <w:szCs w:val="18"/>
+        </w:rPr>
+        <w:t xml:space="preserve">** Los archetypes employee-faculty (135) y employee-staff (3.144) reflejan la clasificacion actual del resource Trabajadores, que identifica como docente unicamente a quienes poseen categorizacion academica formal en ENOC.CAT_DOCENTE (estado 02). La planta docente real es de aproximadamente 1.190 docentes universitarios; los docentes sin categorizacion formal figuran provisionalmente bajo employee-staff. Ajustar el criterio de clasificacion docente/administrativo es una tarea pendiente del proyecto.</w:t>
       </w:r>
     </w:p>
     <w:p>
@@ -22136,6 +22155,148 @@
                 <w:sz w:val="18"/>
                 <w:szCs w:val="18"/>
               </w:rPr>
+              <w:t xml:space="preserve">Docentes clasificados con archetype faculty</w:t>
+            </w:r>
+          </w:p>
+        </w:tc>
+        <w:tc>
+          <w:tcPr>
+            <w:tcW w:type="dxa" w:w="2000"/>
+            <w:tcBorders>
+              <w:top w:val="single" w:color="D1D5DB" w:sz="4"/>
+              <w:left w:val="single" w:color="D1D5DB" w:sz="4"/>
+              <w:bottom w:val="single" w:color="D1D5DB" w:sz="4"/>
+              <w:right w:val="single" w:color="D1D5DB" w:sz="4"/>
+            </w:tcBorders>
+            <w:shd w:fill="F0F7FF" w:val="clear"/>
+            <w:tcMar>
+              <w:top w:type="dxa" w:w="80"/>
+              <w:left w:type="dxa" w:w="120"/>
+              <w:bottom w:type="dxa" w:w="80"/>
+              <w:right w:type="dxa" w:w="120"/>
+            </w:tcMar>
+            <w:vAlign w:val="center"/>
+          </w:tcPr>
+          <w:p>
+            <w:pPr>
+              <w:jc w:val="left"/>
+            </w:pPr>
+            <w:r>
+              <w:rPr>
+                <w:rFonts w:ascii="Arial" w:cs="Arial" w:eastAsia="Arial" w:hAnsi="Arial"/>
+                <w:b w:val="false"/>
+                <w:bCs w:val="false"/>
+                <w:color w:val="111827"/>
+                <w:sz w:val="18"/>
+                <w:szCs w:val="18"/>
+              </w:rPr>
+              <w:t xml:space="preserve">~1.190</w:t>
+            </w:r>
+          </w:p>
+        </w:tc>
+        <w:tc>
+          <w:tcPr>
+            <w:tcW w:type="dxa" w:w="2000"/>
+            <w:tcBorders>
+              <w:top w:val="single" w:color="D1D5DB" w:sz="4"/>
+              <w:left w:val="single" w:color="D1D5DB" w:sz="4"/>
+              <w:bottom w:val="single" w:color="D1D5DB" w:sz="4"/>
+              <w:right w:val="single" w:color="D1D5DB" w:sz="4"/>
+            </w:tcBorders>
+            <w:shd w:fill="F0F7FF" w:val="clear"/>
+            <w:tcMar>
+              <w:top w:type="dxa" w:w="80"/>
+              <w:left w:type="dxa" w:w="120"/>
+              <w:bottom w:type="dxa" w:w="80"/>
+              <w:right w:type="dxa" w:w="120"/>
+            </w:tcMar>
+            <w:vAlign w:val="center"/>
+          </w:tcPr>
+          <w:p>
+            <w:pPr>
+              <w:jc w:val="left"/>
+            </w:pPr>
+            <w:r>
+              <w:rPr>
+                <w:rFonts w:ascii="Arial" w:cs="Arial" w:eastAsia="Arial" w:hAnsi="Arial"/>
+                <w:b w:val="false"/>
+                <w:bCs w:val="false"/>
+                <w:color w:val="111827"/>
+                <w:sz w:val="18"/>
+                <w:szCs w:val="18"/>
+              </w:rPr>
+              <w:t xml:space="preserve">Pendiente (135; criterio CAT_DOCENTE estado 02)</w:t>
+            </w:r>
+          </w:p>
+        </w:tc>
+        <w:tc>
+          <w:tcPr>
+            <w:tcW w:type="dxa" w:w="2160"/>
+            <w:tcBorders>
+              <w:top w:val="single" w:color="D1D5DB" w:sz="4"/>
+              <w:left w:val="single" w:color="D1D5DB" w:sz="4"/>
+              <w:bottom w:val="single" w:color="D1D5DB" w:sz="4"/>
+              <w:right w:val="single" w:color="D1D5DB" w:sz="4"/>
+            </w:tcBorders>
+            <w:shd w:fill="F0F7FF" w:val="clear"/>
+            <w:tcMar>
+              <w:top w:type="dxa" w:w="80"/>
+              <w:left w:type="dxa" w:w="120"/>
+              <w:bottom w:type="dxa" w:w="80"/>
+              <w:right w:type="dxa" w:w="120"/>
+            </w:tcMar>
+            <w:vAlign w:val="center"/>
+          </w:tcPr>
+          <w:p>
+            <w:pPr>
+              <w:jc w:val="left"/>
+            </w:pPr>
+            <w:r>
+              <w:rPr>
+                <w:rFonts w:ascii="Arial" w:cs="Arial" w:eastAsia="Arial" w:hAnsi="Arial"/>
+                <w:b w:val="false"/>
+                <w:bCs w:val="false"/>
+                <w:color w:val="111827"/>
+                <w:sz w:val="18"/>
+                <w:szCs w:val="18"/>
+              </w:rPr>
+              <w:t xml:space="preserve">BD PostgreSQL PROD</w:t>
+            </w:r>
+          </w:p>
+        </w:tc>
+      </w:tr>
+      <w:tr>
+        <w:tc>
+          <w:tcPr>
+            <w:tcW w:type="dxa" w:w="3200"/>
+            <w:tcBorders>
+              <w:top w:val="single" w:color="D1D5DB" w:sz="4"/>
+              <w:left w:val="single" w:color="D1D5DB" w:sz="4"/>
+              <w:bottom w:val="single" w:color="D1D5DB" w:sz="4"/>
+              <w:right w:val="single" w:color="D1D5DB" w:sz="4"/>
+            </w:tcBorders>
+            <w:shd w:fill="FFFFFF" w:val="clear"/>
+            <w:tcMar>
+              <w:top w:type="dxa" w:w="80"/>
+              <w:left w:type="dxa" w:w="120"/>
+              <w:bottom w:type="dxa" w:w="80"/>
+              <w:right w:type="dxa" w:w="120"/>
+            </w:tcMar>
+            <w:vAlign w:val="center"/>
+          </w:tcPr>
+          <w:p>
+            <w:pPr>
+              <w:jc w:val="left"/>
+            </w:pPr>
+            <w:r>
+              <w:rPr>
+                <w:rFonts w:ascii="Arial" w:cs="Arial" w:eastAsia="Arial" w:hAnsi="Arial"/>
+                <w:b w:val="false"/>
+                <w:bCs w:val="false"/>
+                <w:color w:val="111827"/>
+                <w:sz w:val="18"/>
+                <w:szCs w:val="18"/>
+              </w:rPr>
               <w:t xml:space="preserve">Roles activos en repo (GitOps sync)</w:t>
             </w:r>
           </w:p>
@@ -22149,7 +22310,7 @@
               <w:bottom w:val="single" w:color="D1D5DB" w:sz="4"/>
               <w:right w:val="single" w:color="D1D5DB" w:sz="4"/>
             </w:tcBorders>
-            <w:shd w:fill="F0F7FF" w:val="clear"/>
+            <w:shd w:fill="FFFFFF" w:val="clear"/>
             <w:tcMar>
               <w:top w:type="dxa" w:w="80"/>
               <w:left w:type="dxa" w:w="120"/>
@@ -22219,7 +22380,7 @@
               <w:bottom w:val="single" w:color="D1D5DB" w:sz="4"/>
               <w:right w:val="single" w:color="D1D5DB" w:sz="4"/>
             </w:tcBorders>
-            <w:shd w:fill="F0F7FF" w:val="clear"/>
+            <w:shd w:fill="FFFFFF" w:val="clear"/>
             <w:tcMar>
               <w:top w:type="dxa" w:w="80"/>
               <w:left w:type="dxa" w:w="120"/>
@@ -22256,7 +22417,7 @@
               <w:bottom w:val="single" w:color="D1D5DB" w:sz="4"/>
               <w:right w:val="single" w:color="D1D5DB" w:sz="4"/>
             </w:tcBorders>
-            <w:shd w:fill="FFFFFF" w:val="clear"/>
+            <w:shd w:fill="F0F7FF" w:val="clear"/>
             <w:tcMar>
               <w:top w:type="dxa" w:w="80"/>
               <w:left w:type="dxa" w:w="120"/>
@@ -22291,7 +22452,7 @@
               <w:bottom w:val="single" w:color="D1D5DB" w:sz="4"/>
               <w:right w:val="single" w:color="D1D5DB" w:sz="4"/>
             </w:tcBorders>
-            <w:shd w:fill="FFFFFF" w:val="clear"/>
+            <w:shd w:fill="F0F7FF" w:val="clear"/>
             <w:tcMar>
               <w:top w:type="dxa" w:w="80"/>
               <w:left w:type="dxa" w:w="120"/>
@@ -22361,7 +22522,7 @@
               <w:bottom w:val="single" w:color="D1D5DB" w:sz="4"/>
               <w:right w:val="single" w:color="D1D5DB" w:sz="4"/>
             </w:tcBorders>
-            <w:shd w:fill="FFFFFF" w:val="clear"/>
+            <w:shd w:fill="F0F7FF" w:val="clear"/>
             <w:tcMar>
               <w:top w:type="dxa" w:w="80"/>
               <w:left w:type="dxa" w:w="120"/>
@@ -22398,7 +22559,7 @@
               <w:bottom w:val="single" w:color="D1D5DB" w:sz="4"/>
               <w:right w:val="single" w:color="D1D5DB" w:sz="4"/>
             </w:tcBorders>
-            <w:shd w:fill="F0F7FF" w:val="clear"/>
+            <w:shd w:fill="FFFFFF" w:val="clear"/>
             <w:tcMar>
               <w:top w:type="dxa" w:w="80"/>
               <w:left w:type="dxa" w:w="120"/>
@@ -22433,7 +22594,7 @@
               <w:bottom w:val="single" w:color="D1D5DB" w:sz="4"/>
               <w:right w:val="single" w:color="D1D5DB" w:sz="4"/>
             </w:tcBorders>
-            <w:shd w:fill="F0F7FF" w:val="clear"/>
+            <w:shd w:fill="FFFFFF" w:val="clear"/>
             <w:tcMar>
               <w:top w:type="dxa" w:w="80"/>
               <w:left w:type="dxa" w:w="120"/>
@@ -22468,7 +22629,7 @@
               <w:bottom w:val="single" w:color="D1D5DB" w:sz="4"/>
               <w:right w:val="single" w:color="D1D5DB" w:sz="4"/>
             </w:tcBorders>
-            <w:shd w:fill="F0F7FF" w:val="clear"/>
+            <w:shd w:fill="FFFFFF" w:val="clear"/>
             <w:tcMar>
               <w:top w:type="dxa" w:w="80"/>
               <w:left w:type="dxa" w:w="120"/>
@@ -22503,7 +22664,7 @@
               <w:bottom w:val="single" w:color="D1D5DB" w:sz="4"/>
               <w:right w:val="single" w:color="D1D5DB" w:sz="4"/>
             </w:tcBorders>
-            <w:shd w:fill="F0F7FF" w:val="clear"/>
+            <w:shd w:fill="FFFFFF" w:val="clear"/>
             <w:tcMar>
               <w:top w:type="dxa" w:w="80"/>
               <w:left w:type="dxa" w:w="120"/>
@@ -22540,7 +22701,7 @@
               <w:bottom w:val="single" w:color="D1D5DB" w:sz="4"/>
               <w:right w:val="single" w:color="D1D5DB" w:sz="4"/>
             </w:tcBorders>
-            <w:shd w:fill="FFFFFF" w:val="clear"/>
+            <w:shd w:fill="F0F7FF" w:val="clear"/>
             <w:tcMar>
               <w:top w:type="dxa" w:w="80"/>
               <w:left w:type="dxa" w:w="120"/>
@@ -22575,7 +22736,7 @@
               <w:bottom w:val="single" w:color="D1D5DB" w:sz="4"/>
               <w:right w:val="single" w:color="D1D5DB" w:sz="4"/>
             </w:tcBorders>
-            <w:shd w:fill="FFFFFF" w:val="clear"/>
+            <w:shd w:fill="F0F7FF" w:val="clear"/>
             <w:tcMar>
               <w:top w:type="dxa" w:w="80"/>
               <w:left w:type="dxa" w:w="120"/>
@@ -22610,7 +22771,7 @@
               <w:bottom w:val="single" w:color="D1D5DB" w:sz="4"/>
               <w:right w:val="single" w:color="D1D5DB" w:sz="4"/>
             </w:tcBorders>
-            <w:shd w:fill="FFFFFF" w:val="clear"/>
+            <w:shd w:fill="F0F7FF" w:val="clear"/>
             <w:tcMar>
               <w:top w:type="dxa" w:w="80"/>
               <w:left w:type="dxa" w:w="120"/>
@@ -22645,7 +22806,7 @@
               <w:bottom w:val="single" w:color="D1D5DB" w:sz="4"/>
               <w:right w:val="single" w:color="D1D5DB" w:sz="4"/>
             </w:tcBorders>
-            <w:shd w:fill="FFFFFF" w:val="clear"/>
+            <w:shd w:fill="F0F7FF" w:val="clear"/>
             <w:tcMar>
               <w:top w:type="dxa" w:w="80"/>
               <w:left w:type="dxa" w:w="120"/>
@@ -22682,7 +22843,7 @@
               <w:bottom w:val="single" w:color="D1D5DB" w:sz="4"/>
               <w:right w:val="single" w:color="D1D5DB" w:sz="4"/>
             </w:tcBorders>
-            <w:shd w:fill="F0F7FF" w:val="clear"/>
+            <w:shd w:fill="FFFFFF" w:val="clear"/>
             <w:tcMar>
               <w:top w:type="dxa" w:w="80"/>
               <w:left w:type="dxa" w:w="120"/>
@@ -22717,7 +22878,7 @@
               <w:bottom w:val="single" w:color="D1D5DB" w:sz="4"/>
               <w:right w:val="single" w:color="D1D5DB" w:sz="4"/>
             </w:tcBorders>
-            <w:shd w:fill="F0F7FF" w:val="clear"/>
+            <w:shd w:fill="FFFFFF" w:val="clear"/>
             <w:tcMar>
               <w:top w:type="dxa" w:w="80"/>
               <w:left w:type="dxa" w:w="120"/>
@@ -22752,7 +22913,7 @@
               <w:bottom w:val="single" w:color="D1D5DB" w:sz="4"/>
               <w:right w:val="single" w:color="D1D5DB" w:sz="4"/>
             </w:tcBorders>
-            <w:shd w:fill="F0F7FF" w:val="clear"/>
+            <w:shd w:fill="FFFFFF" w:val="clear"/>
             <w:tcMar>
               <w:top w:type="dxa" w:w="80"/>
               <w:left w:type="dxa" w:w="120"/>
@@ -22787,7 +22948,7 @@
               <w:bottom w:val="single" w:color="D1D5DB" w:sz="4"/>
               <w:right w:val="single" w:color="D1D5DB" w:sz="4"/>
             </w:tcBorders>
-            <w:shd w:fill="F0F7FF" w:val="clear"/>
+            <w:shd w:fill="FFFFFF" w:val="clear"/>
             <w:tcMar>
               <w:top w:type="dxa" w:w="80"/>
               <w:left w:type="dxa" w:w="120"/>
@@ -22824,7 +22985,7 @@
               <w:bottom w:val="single" w:color="D1D5DB" w:sz="4"/>
               <w:right w:val="single" w:color="D1D5DB" w:sz="4"/>
             </w:tcBorders>
-            <w:shd w:fill="FFFFFF" w:val="clear"/>
+            <w:shd w:fill="F0F7FF" w:val="clear"/>
             <w:tcMar>
               <w:top w:type="dxa" w:w="80"/>
               <w:left w:type="dxa" w:w="120"/>
@@ -22859,7 +23020,7 @@
               <w:bottom w:val="single" w:color="D1D5DB" w:sz="4"/>
               <w:right w:val="single" w:color="D1D5DB" w:sz="4"/>
             </w:tcBorders>
-            <w:shd w:fill="FFFFFF" w:val="clear"/>
+            <w:shd w:fill="F0F7FF" w:val="clear"/>
             <w:tcMar>
               <w:top w:type="dxa" w:w="80"/>
               <w:left w:type="dxa" w:w="120"/>
@@ -22894,7 +23055,7 @@
               <w:bottom w:val="single" w:color="D1D5DB" w:sz="4"/>
               <w:right w:val="single" w:color="D1D5DB" w:sz="4"/>
             </w:tcBorders>
-            <w:shd w:fill="FFFFFF" w:val="clear"/>
+            <w:shd w:fill="F0F7FF" w:val="clear"/>
             <w:tcMar>
               <w:top w:type="dxa" w:w="80"/>
               <w:left w:type="dxa" w:w="120"/>
@@ -22929,7 +23090,7 @@
               <w:bottom w:val="single" w:color="D1D5DB" w:sz="4"/>
               <w:right w:val="single" w:color="D1D5DB" w:sz="4"/>
             </w:tcBorders>
-            <w:shd w:fill="FFFFFF" w:val="clear"/>
+            <w:shd w:fill="F0F7FF" w:val="clear"/>
             <w:tcMar>
               <w:top w:type="dxa" w:w="80"/>
               <w:left w:type="dxa" w:w="120"/>
@@ -23161,6 +23322,25 @@
           <w:szCs w:val="20"/>
         </w:rPr>
         <w:t xml:space="preserve">Carga del padron estudiantil completo: parametrizar dinamicamente el semestre en el resource Oracle LAMB Estudiantes (hoy fijado al ciclo Verano 2026, ID_SEMESTRE = 279) para incorporar los aproximadamente 23.620 estudiantes del ciclo regular vigente.</w:t>
+      </w:r>
+    </w:p>
+    <w:p>
+      <w:pPr>
+        <w:pStyle w:val="ListParagraph"/>
+        <w:numPr>
+          <w:ilvl w:val="0"/>
+          <w:numId w:val="2"/>
+        </w:numPr>
+        <w:spacing w:after="40" w:before="40"/>
+      </w:pPr>
+      <w:r>
+        <w:rPr>
+          <w:rFonts w:ascii="Arial" w:cs="Arial" w:eastAsia="Arial" w:hAnsi="Arial"/>
+          <w:color w:val="111827"/>
+          <w:sz w:val="20"/>
+          <w:szCs w:val="20"/>
+        </w:rPr>
+        <w:t xml:space="preserve">Correccion del criterio docente/administrativo: ajustar el resource Trabajadores para clasificar como employee-faculty a los aproximadamente 1.190 docentes universitarios reales, no solo a los 135 con categorizacion academica formal en ENOC.CAT_DOCENTE.</w:t>
       </w:r>
     </w:p>
     <w:p>

</xml_diff>

<commit_message>
docs: eliminar Fase 11 (productizacion SciBack) de DTI-IGA-2026-001
SciBack es ajeno a UPeU; no corresponde en un documento de proyecto DTI.

- Removida la fila "Fase 11 - Productizacion SciBack" del cronograma
- Tabla de horas: "Fases 8-11" -> "Fases 8-10" (37.5h -> 25h)
- Total estimado: ~223.5h -> ~210h; ficha actualizada
- Referencias "Fases 1-11" -> "Fases 1-10" (ficha, riesgo R-03)
- Solicitud de aprobacion: fases pendientes (7,8,9,12,13)
- Reformuladas 3 menciones de "reutilizable para otras universidades"
  hacia valor interno UPeU (arquitectura mantenible y basada en estandares)

Co-Authored-By: Claude Sonnet 4.6 <noreply@anthropic.com>
</commit_message>
<xml_diff>
--- a/docs/DTI-IGA-2026-001-Proyecto.docx
+++ b/docs/DTI-IGA-2026-001-Proyecto.docx
@@ -1507,7 +1507,7 @@
                 <w:sz w:val="20"/>
                 <w:szCs w:val="20"/>
               </w:rPr>
-              <w:t xml:space="preserve">Diciembre 2026 (Fases 1-11 completas)</w:t>
+              <w:t xml:space="preserve">Diciembre 2026 (Fases 1-10 completas; Fases 12-13 sujetas a desbloqueo)</w:t>
             </w:r>
           </w:p>
         </w:tc>
@@ -1651,7 +1651,7 @@
                 <w:sz w:val="20"/>
                 <w:szCs w:val="20"/>
               </w:rPr>
-              <w:t xml:space="preserve">~224 horas (estimado total Fases 1-13)</w:t>
+              <w:t xml:space="preserve">~210 horas (estimado total Fases 1-10, 12 y 13)</w:t>
             </w:r>
           </w:p>
         </w:tc>
@@ -5742,7 +5742,7 @@
           <w:sz w:val="20"/>
           <w:szCs w:val="20"/>
         </w:rPr>
-        <w:t xml:space="preserve">Modelo replicable: la arquitectura en capas (canonical/ + upeu/) permite que la inversion de DTI se convierta en un activo reutilizable para otras universidades peruanas sin costo adicional.</w:t>
+        <w:t xml:space="preserve">Arquitectura mantenible: el diseño en capas separa el modelo canonico basado en estandares internacionales de las particularidades institucionales de UPeU, lo que facilita el mantenimiento, las auditorias y la evolucion futura del sistema.</w:t>
       </w:r>
     </w:p>
     <w:p>
@@ -9523,7 +9523,7 @@
           <w:sz w:val="20"/>
           <w:szCs w:val="20"/>
         </w:rPr>
-        <w:t xml:space="preserve">canonical/: modelo generico reutilizable por cualquier universidad peruana (archetypes, schemas eduPerson/SCHAC, roles, templates).</w:t>
+        <w:t xml:space="preserve">canonical/: capa estandar agnostica a la institucion, basada en estandares internacionales (archetypes, schemas eduPerson/SCHAC, roles, object templates).</w:t>
       </w:r>
     </w:p>
     <w:p>
@@ -12649,7 +12649,7 @@
                 <w:sz w:val="18"/>
                 <w:szCs w:val="18"/>
               </w:rPr>
-              <w:t xml:space="preserve">Fase 11</w:t>
+              <w:t xml:space="preserve">Fase 12</w:t>
             </w:r>
           </w:p>
         </w:tc>
@@ -12684,7 +12684,7 @@
                 <w:sz w:val="18"/>
                 <w:szCs w:val="18"/>
               </w:rPr>
-              <w:t xml:space="preserve">Productizacion SciBack (canon reutilizable)</w:t>
+              <w:t xml:space="preserve">Gobierno completo Entra ID (writes + AUs)</w:t>
             </w:r>
           </w:p>
         </w:tc>
@@ -12838,253 +12838,6 @@
               <w:right w:val="single" w:color="D1D5DB" w:sz="4"/>
             </w:tcBorders>
             <w:shd w:fill="F0F7FF" w:val="clear"/>
-            <w:tcMar>
-              <w:top w:type="dxa" w:w="80"/>
-              <w:left w:type="dxa" w:w="120"/>
-              <w:bottom w:type="dxa" w:w="80"/>
-              <w:right w:type="dxa" w:w="120"/>
-            </w:tcMar>
-            <w:vAlign w:val="center"/>
-          </w:tcPr>
-          <w:p>
-            <w:pPr>
-              <w:jc w:val="left"/>
-            </w:pPr>
-            <w:r>
-              <w:rPr>
-                <w:rFonts w:ascii="Arial" w:cs="Arial" w:eastAsia="Arial" w:hAnsi="Arial"/>
-                <w:b/>
-                <w:bCs/>
-                <w:color w:val="6B7280"/>
-                <w:sz w:val="18"/>
-                <w:szCs w:val="18"/>
-              </w:rPr>
-              <w:t xml:space="preserve">NO INICIADA</w:t>
-            </w:r>
-          </w:p>
-        </w:tc>
-      </w:tr>
-      <w:tr>
-        <w:tc>
-          <w:tcPr>
-            <w:tcW w:type="dxa" w:w="1200"/>
-            <w:tcBorders>
-              <w:top w:val="single" w:color="D1D5DB" w:sz="4"/>
-              <w:left w:val="single" w:color="D1D5DB" w:sz="4"/>
-              <w:bottom w:val="single" w:color="D1D5DB" w:sz="4"/>
-              <w:right w:val="single" w:color="D1D5DB" w:sz="4"/>
-            </w:tcBorders>
-            <w:shd w:fill="FFFFFF" w:val="clear"/>
-            <w:tcMar>
-              <w:top w:type="dxa" w:w="80"/>
-              <w:left w:type="dxa" w:w="120"/>
-              <w:bottom w:type="dxa" w:w="80"/>
-              <w:right w:type="dxa" w:w="120"/>
-            </w:tcMar>
-            <w:vAlign w:val="center"/>
-          </w:tcPr>
-          <w:p>
-            <w:pPr>
-              <w:jc w:val="left"/>
-            </w:pPr>
-            <w:r>
-              <w:rPr>
-                <w:rFonts w:ascii="Arial" w:cs="Arial" w:eastAsia="Arial" w:hAnsi="Arial"/>
-                <w:b/>
-                <w:bCs/>
-                <w:color w:val="111827"/>
-                <w:sz w:val="18"/>
-                <w:szCs w:val="18"/>
-              </w:rPr>
-              <w:t xml:space="preserve">Fase 12</w:t>
-            </w:r>
-          </w:p>
-        </w:tc>
-        <w:tc>
-          <w:tcPr>
-            <w:tcW w:type="dxa" w:w="2600"/>
-            <w:tcBorders>
-              <w:top w:val="single" w:color="D1D5DB" w:sz="4"/>
-              <w:left w:val="single" w:color="D1D5DB" w:sz="4"/>
-              <w:bottom w:val="single" w:color="D1D5DB" w:sz="4"/>
-              <w:right w:val="single" w:color="D1D5DB" w:sz="4"/>
-            </w:tcBorders>
-            <w:shd w:fill="FFFFFF" w:val="clear"/>
-            <w:tcMar>
-              <w:top w:type="dxa" w:w="80"/>
-              <w:left w:type="dxa" w:w="120"/>
-              <w:bottom w:type="dxa" w:w="80"/>
-              <w:right w:type="dxa" w:w="120"/>
-            </w:tcMar>
-            <w:vAlign w:val="center"/>
-          </w:tcPr>
-          <w:p>
-            <w:pPr>
-              <w:jc w:val="left"/>
-            </w:pPr>
-            <w:r>
-              <w:rPr>
-                <w:rFonts w:ascii="Arial" w:cs="Arial" w:eastAsia="Arial" w:hAnsi="Arial"/>
-                <w:b w:val="false"/>
-                <w:bCs w:val="false"/>
-                <w:color w:val="111827"/>
-                <w:sz w:val="18"/>
-                <w:szCs w:val="18"/>
-              </w:rPr>
-              <w:t xml:space="preserve">Gobierno completo Entra ID (writes + AUs)</w:t>
-            </w:r>
-          </w:p>
-        </w:tc>
-        <w:tc>
-          <w:tcPr>
-            <w:tcW w:type="dxa" w:w="700"/>
-            <w:tcBorders>
-              <w:top w:val="single" w:color="D1D5DB" w:sz="4"/>
-              <w:left w:val="single" w:color="D1D5DB" w:sz="4"/>
-              <w:bottom w:val="single" w:color="D1D5DB" w:sz="4"/>
-              <w:right w:val="single" w:color="D1D5DB" w:sz="4"/>
-            </w:tcBorders>
-            <w:shd w:fill="FFFFFF" w:val="clear"/>
-            <w:tcMar>
-              <w:top w:type="dxa" w:w="80"/>
-              <w:left w:type="dxa" w:w="120"/>
-              <w:bottom w:type="dxa" w:w="80"/>
-              <w:right w:type="dxa" w:w="120"/>
-            </w:tcMar>
-            <w:vAlign w:val="center"/>
-          </w:tcPr>
-          <w:p>
-            <w:pPr>
-              <w:jc w:val="center"/>
-            </w:pPr>
-            <w:r>
-              <w:rPr>
-                <w:rFonts w:ascii="Arial" w:cs="Arial" w:eastAsia="Arial" w:hAnsi="Arial"/>
-                <w:b w:val="false"/>
-                <w:bCs w:val="false"/>
-                <w:color w:val="111827"/>
-                <w:sz w:val="18"/>
-                <w:szCs w:val="18"/>
-              </w:rPr>
-              <w:t xml:space="preserve"/>
-            </w:r>
-          </w:p>
-        </w:tc>
-        <w:tc>
-          <w:tcPr>
-            <w:tcW w:type="dxa" w:w="700"/>
-            <w:tcBorders>
-              <w:top w:val="single" w:color="D1D5DB" w:sz="4"/>
-              <w:left w:val="single" w:color="D1D5DB" w:sz="4"/>
-              <w:bottom w:val="single" w:color="D1D5DB" w:sz="4"/>
-              <w:right w:val="single" w:color="D1D5DB" w:sz="4"/>
-            </w:tcBorders>
-            <w:shd w:fill="FFFFFF" w:val="clear"/>
-            <w:tcMar>
-              <w:top w:type="dxa" w:w="80"/>
-              <w:left w:type="dxa" w:w="120"/>
-              <w:bottom w:type="dxa" w:w="80"/>
-              <w:right w:type="dxa" w:w="120"/>
-            </w:tcMar>
-            <w:vAlign w:val="center"/>
-          </w:tcPr>
-          <w:p>
-            <w:pPr>
-              <w:jc w:val="center"/>
-            </w:pPr>
-            <w:r>
-              <w:rPr>
-                <w:rFonts w:ascii="Arial" w:cs="Arial" w:eastAsia="Arial" w:hAnsi="Arial"/>
-                <w:b w:val="false"/>
-                <w:bCs w:val="false"/>
-                <w:color w:val="111827"/>
-                <w:sz w:val="18"/>
-                <w:szCs w:val="18"/>
-              </w:rPr>
-              <w:t xml:space="preserve"/>
-            </w:r>
-          </w:p>
-        </w:tc>
-        <w:tc>
-          <w:tcPr>
-            <w:tcW w:type="dxa" w:w="700"/>
-            <w:tcBorders>
-              <w:top w:val="single" w:color="D1D5DB" w:sz="4"/>
-              <w:left w:val="single" w:color="D1D5DB" w:sz="4"/>
-              <w:bottom w:val="single" w:color="D1D5DB" w:sz="4"/>
-              <w:right w:val="single" w:color="D1D5DB" w:sz="4"/>
-            </w:tcBorders>
-            <w:shd w:fill="FFFFFF" w:val="clear"/>
-            <w:tcMar>
-              <w:top w:type="dxa" w:w="80"/>
-              <w:left w:type="dxa" w:w="120"/>
-              <w:bottom w:type="dxa" w:w="80"/>
-              <w:right w:type="dxa" w:w="120"/>
-            </w:tcMar>
-            <w:vAlign w:val="center"/>
-          </w:tcPr>
-          <w:p>
-            <w:pPr>
-              <w:jc w:val="center"/>
-            </w:pPr>
-            <w:r>
-              <w:rPr>
-                <w:rFonts w:ascii="Arial" w:cs="Arial" w:eastAsia="Arial" w:hAnsi="Arial"/>
-                <w:b w:val="false"/>
-                <w:bCs w:val="false"/>
-                <w:color w:val="111827"/>
-                <w:sz w:val="18"/>
-                <w:szCs w:val="18"/>
-              </w:rPr>
-              <w:t xml:space="preserve">X</w:t>
-            </w:r>
-          </w:p>
-        </w:tc>
-        <w:tc>
-          <w:tcPr>
-            <w:tcW w:type="dxa" w:w="700"/>
-            <w:tcBorders>
-              <w:top w:val="single" w:color="D1D5DB" w:sz="4"/>
-              <w:left w:val="single" w:color="D1D5DB" w:sz="4"/>
-              <w:bottom w:val="single" w:color="D1D5DB" w:sz="4"/>
-              <w:right w:val="single" w:color="D1D5DB" w:sz="4"/>
-            </w:tcBorders>
-            <w:shd w:fill="FFFFFF" w:val="clear"/>
-            <w:tcMar>
-              <w:top w:type="dxa" w:w="80"/>
-              <w:left w:type="dxa" w:w="120"/>
-              <w:bottom w:type="dxa" w:w="80"/>
-              <w:right w:type="dxa" w:w="120"/>
-            </w:tcMar>
-            <w:vAlign w:val="center"/>
-          </w:tcPr>
-          <w:p>
-            <w:pPr>
-              <w:jc w:val="center"/>
-            </w:pPr>
-            <w:r>
-              <w:rPr>
-                <w:rFonts w:ascii="Arial" w:cs="Arial" w:eastAsia="Arial" w:hAnsi="Arial"/>
-                <w:b w:val="false"/>
-                <w:bCs w:val="false"/>
-                <w:color w:val="111827"/>
-                <w:sz w:val="18"/>
-                <w:szCs w:val="18"/>
-              </w:rPr>
-              <w:t xml:space="preserve">X</w:t>
-            </w:r>
-          </w:p>
-        </w:tc>
-        <w:tc>
-          <w:tcPr>
-            <w:tcW w:type="dxa" w:w="1760"/>
-            <w:tcBorders>
-              <w:top w:val="single" w:color="D1D5DB" w:sz="4"/>
-              <w:left w:val="single" w:color="D1D5DB" w:sz="4"/>
-              <w:bottom w:val="single" w:color="D1D5DB" w:sz="4"/>
-              <w:right w:val="single" w:color="D1D5DB" w:sz="4"/>
-            </w:tcBorders>
-            <w:shd w:fill="FFFFFF" w:val="clear"/>
             <w:tcMar>
               <w:top w:type="dxa" w:w="80"/>
               <w:left w:type="dxa" w:w="120"/>
@@ -13121,7 +12874,7 @@
               <w:bottom w:val="single" w:color="D1D5DB" w:sz="4"/>
               <w:right w:val="single" w:color="D1D5DB" w:sz="4"/>
             </w:tcBorders>
-            <w:shd w:fill="F0F7FF" w:val="clear"/>
+            <w:shd w:fill="FFFFFF" w:val="clear"/>
             <w:tcMar>
               <w:top w:type="dxa" w:w="80"/>
               <w:left w:type="dxa" w:w="120"/>
@@ -13156,7 +12909,7 @@
               <w:bottom w:val="single" w:color="D1D5DB" w:sz="4"/>
               <w:right w:val="single" w:color="D1D5DB" w:sz="4"/>
             </w:tcBorders>
-            <w:shd w:fill="F0F7FF" w:val="clear"/>
+            <w:shd w:fill="FFFFFF" w:val="clear"/>
             <w:tcMar>
               <w:top w:type="dxa" w:w="80"/>
               <w:left w:type="dxa" w:w="120"/>
@@ -13191,7 +12944,7 @@
               <w:bottom w:val="single" w:color="D1D5DB" w:sz="4"/>
               <w:right w:val="single" w:color="D1D5DB" w:sz="4"/>
             </w:tcBorders>
-            <w:shd w:fill="F0F7FF" w:val="clear"/>
+            <w:shd w:fill="FFFFFF" w:val="clear"/>
             <w:tcMar>
               <w:top w:type="dxa" w:w="80"/>
               <w:left w:type="dxa" w:w="120"/>
@@ -13226,7 +12979,7 @@
               <w:bottom w:val="single" w:color="D1D5DB" w:sz="4"/>
               <w:right w:val="single" w:color="D1D5DB" w:sz="4"/>
             </w:tcBorders>
-            <w:shd w:fill="F0F7FF" w:val="clear"/>
+            <w:shd w:fill="FFFFFF" w:val="clear"/>
             <w:tcMar>
               <w:top w:type="dxa" w:w="80"/>
               <w:left w:type="dxa" w:w="120"/>
@@ -13261,7 +13014,7 @@
               <w:bottom w:val="single" w:color="D1D5DB" w:sz="4"/>
               <w:right w:val="single" w:color="D1D5DB" w:sz="4"/>
             </w:tcBorders>
-            <w:shd w:fill="F0F7FF" w:val="clear"/>
+            <w:shd w:fill="FFFFFF" w:val="clear"/>
             <w:tcMar>
               <w:top w:type="dxa" w:w="80"/>
               <w:left w:type="dxa" w:w="120"/>
@@ -13296,7 +13049,7 @@
               <w:bottom w:val="single" w:color="D1D5DB" w:sz="4"/>
               <w:right w:val="single" w:color="D1D5DB" w:sz="4"/>
             </w:tcBorders>
-            <w:shd w:fill="F0F7FF" w:val="clear"/>
+            <w:shd w:fill="FFFFFF" w:val="clear"/>
             <w:tcMar>
               <w:top w:type="dxa" w:w="80"/>
               <w:left w:type="dxa" w:w="120"/>
@@ -13331,7 +13084,7 @@
               <w:bottom w:val="single" w:color="D1D5DB" w:sz="4"/>
               <w:right w:val="single" w:color="D1D5DB" w:sz="4"/>
             </w:tcBorders>
-            <w:shd w:fill="F0F7FF" w:val="clear"/>
+            <w:shd w:fill="FFFFFF" w:val="clear"/>
             <w:tcMar>
               <w:top w:type="dxa" w:w="80"/>
               <w:left w:type="dxa" w:w="120"/>
@@ -18601,7 +18354,7 @@
                 <w:sz w:val="18"/>
                 <w:szCs w:val="18"/>
               </w:rPr>
-              <w:t xml:space="preserve">Fases 8-11: Docs, piloto, prod, productizacion</w:t>
+              <w:t xml:space="preserve">Fases 8-10: Docs, piloto, deploy PROD</w:t>
             </w:r>
           </w:p>
         </w:tc>
@@ -18636,7 +18389,7 @@
                 <w:sz w:val="18"/>
                 <w:szCs w:val="18"/>
               </w:rPr>
-              <w:t xml:space="preserve">37.5h</w:t>
+              <w:t xml:space="preserve">25h</w:t>
             </w:r>
           </w:p>
         </w:tc>
@@ -19062,7 +18815,7 @@
                 <w:sz w:val="20"/>
                 <w:szCs w:val="20"/>
               </w:rPr>
-              <w:t xml:space="preserve">~223.5h</w:t>
+              <w:t xml:space="preserve">~210h</w:t>
             </w:r>
           </w:p>
         </w:tc>
@@ -20074,7 +19827,7 @@
                 <w:sz w:val="18"/>
                 <w:szCs w:val="18"/>
               </w:rPr>
-              <w:t xml:space="preserve">Escalamiento formal con fecha limite. Fases 1-11 no requieren write Entra ID. Fase 12 tiene fecha floating.</w:t>
+              <w:t xml:space="preserve">Escalamiento formal con fecha limite. Fases 1-10 no requieren write Entra ID. Fase 12 tiene fecha floating.</w:t>
             </w:r>
           </w:p>
         </w:tc>
@@ -23281,7 +23034,7 @@
           <w:sz w:val="20"/>
           <w:szCs w:val="20"/>
         </w:rPr>
-        <w:t xml:space="preserve">Modelo de dos capas canonical/ + upeu/ que convierte la inversion DTI en un activo reutilizable para otras universidades peruanas.</w:t>
+        <w:t xml:space="preserve">Arquitectura en dos capas (modelo canonico estandar + overlay UPeU) que mantiene la configuracion ordenada, versionada y alineada con estandares internacionales (eduPerson, SCHAC, ISO 24760).</w:t>
       </w:r>
     </w:p>
     <w:p>
@@ -23475,7 +23228,7 @@
           <w:sz w:val="20"/>
           <w:szCs w:val="20"/>
         </w:rPr>
-        <w:t xml:space="preserve">La continuacion de las fases pendientes (7, 8, 9, 11, 12, 13) dentro del calendario establecido.</w:t>
+        <w:t xml:space="preserve">La continuacion de las fases pendientes (7, 8, 9, 12, 13) dentro del calendario establecido.</w:t>
       </w:r>
     </w:p>
     <w:p>

</xml_diff>

<commit_message>
docs: corregir ortografia espanola completa en DTI-IGA-2026-001
- 330+ palabras corregidas: tildes y ñ (dirección, tecnologías,
  información, gestión, ejecución, validación, código, análisis,
  estándar, métricas, matrícula, padrón, huérfanas, diseño, año, etc.)
- Verbos: está/están, habilitará, gobernará, se tomará, automatizó,
  concluía, podía, había, existía, tenían
- Conserva ediciones del usuario: conector Koha sin "(desarrollado DTI)",
  linea de fecha de firma extendida, email jsanchez@upeu.edu.pe
- generate-project-doc.js ahora con ortografia correcta como fuente

Co-Authored-By: Claude Sonnet 4.6 <noreply@anthropic.com>
</commit_message>
<xml_diff>
--- a/docs/DTI-IGA-2026-001-Proyecto.docx
+++ b/docs/DTI-IGA-2026-001-Proyecto.docx
@@ -16,7 +16,7 @@
           <w:sz w:val="20"/>
           <w:szCs w:val="20"/>
         </w:rPr>
-        <w:t xml:space="preserve">UNIVERSIDAD PERUANA UNION</w:t>
+        <w:t xml:space="preserve">UNIVERSIDAD PERUANA UNIÓN</w:t>
       </w:r>
     </w:p>
     <w:p>
@@ -31,7 +31,7 @@
           <w:sz w:val="20"/>
           <w:szCs w:val="20"/>
         </w:rPr>
-        <w:t xml:space="preserve">Direccion de Tecnologias de Informacion</w:t>
+        <w:t xml:space="preserve">Dirección de Tecnologías de Información</w:t>
       </w:r>
     </w:p>
     <w:tbl>
@@ -112,7 +112,7 @@
                 <w:sz w:val="28"/>
                 <w:szCs w:val="28"/>
               </w:rPr>
-              <w:t xml:space="preserve">Universidad Peruana Union — Tres Campus</w:t>
+              <w:t xml:space="preserve">Universidad Peruana Unión — Tres Campus</w:t>
             </w:r>
           </w:p>
           <w:p>
@@ -129,7 +129,7 @@
                 <w:sz w:val="24"/>
                 <w:szCs w:val="24"/>
               </w:rPr>
-              <w:t xml:space="preserve">Codigo: DTI-IGA-2026-001</w:t>
+              <w:t xml:space="preserve">Código: DTI-IGA-2026-001</w:t>
             </w:r>
           </w:p>
         </w:tc>
@@ -296,7 +296,7 @@
                 <w:sz w:val="18"/>
                 <w:szCs w:val="18"/>
               </w:rPr>
-              <w:t xml:space="preserve">Integrados via IGA</w:t>
+              <w:t xml:space="preserve">Integrados vía IGA</w:t>
             </w:r>
           </w:p>
         </w:tc>
@@ -485,7 +485,7 @@
                 <w:sz w:val="18"/>
                 <w:szCs w:val="18"/>
               </w:rPr>
-              <w:t xml:space="preserve">Director de Tecnologias de Informacion</w:t>
+              <w:t xml:space="preserve">Director de Tecnologías de Información</w:t>
             </w:r>
           </w:p>
         </w:tc>
@@ -568,7 +568,7 @@
                 <w:sz w:val="18"/>
                 <w:szCs w:val="18"/>
               </w:rPr>
-              <w:t xml:space="preserve">Version: 1.1 | Fecha: 21 de mayo de 2026</w:t>
+              <w:t xml:space="preserve">Versión: 1.1 | Fecha: 21 de mayo de 2026</w:t>
             </w:r>
           </w:p>
         </w:tc>
@@ -603,7 +603,7 @@
                 <w:sz w:val="18"/>
                 <w:szCs w:val="18"/>
               </w:rPr>
-              <w:t xml:space="preserve">Clasificacion: Uso interno DTI</w:t>
+              <w:t xml:space="preserve">Clasificación: Uso interno DTI</w:t>
             </w:r>
           </w:p>
         </w:tc>
@@ -715,7 +715,7 @@
                 <w:sz w:val="22"/>
                 <w:szCs w:val="22"/>
               </w:rPr>
-              <w:t xml:space="preserve">INFORMACION GENERAL DEL PROYECTO</w:t>
+              <w:t xml:space="preserve">INFORMACIÓN GENERAL DEL PROYECTO</w:t>
             </w:r>
           </w:p>
         </w:tc>
@@ -752,7 +752,7 @@
                 <w:sz w:val="20"/>
                 <w:szCs w:val="20"/>
               </w:rPr>
-              <w:t xml:space="preserve">Codigo del proyecto</w:t>
+              <w:t xml:space="preserve">Código del proyecto</w:t>
             </w:r>
           </w:p>
         </w:tc>
@@ -1003,7 +1003,7 @@
                 <w:sz w:val="20"/>
                 <w:szCs w:val="20"/>
               </w:rPr>
-              <w:t xml:space="preserve">Direccion de Tecnologias de Informacion (DTI)</w:t>
+              <w:t xml:space="preserve">Dirección de Tecnologías de Información (DTI)</w:t>
             </w:r>
           </w:p>
         </w:tc>
@@ -1040,7 +1040,7 @@
                 <w:sz w:val="20"/>
                 <w:szCs w:val="20"/>
               </w:rPr>
-              <w:t xml:space="preserve">Alcance geografico</w:t>
+              <w:t xml:space="preserve">Alcance geográfico</w:t>
             </w:r>
           </w:p>
         </w:tc>
@@ -1472,7 +1472,7 @@
                 <w:sz w:val="20"/>
                 <w:szCs w:val="20"/>
               </w:rPr>
-              <w:t xml:space="preserve">Fecha estimada de finalizacion</w:t>
+              <w:t xml:space="preserve">Fecha estimada de finalización</w:t>
             </w:r>
           </w:p>
         </w:tc>
@@ -1723,7 +1723,7 @@
                 <w:sz w:val="20"/>
                 <w:szCs w:val="20"/>
               </w:rPr>
-              <w:t xml:space="preserve">En ejecucion — Fases 1-6 completadas, Fase 7 parcial</w:t>
+              <w:t xml:space="preserve">En ejecución — Fases 1-6 completadas, Fase 7 parcial</w:t>
             </w:r>
           </w:p>
         </w:tc>
@@ -1760,7 +1760,7 @@
                 <w:sz w:val="20"/>
                 <w:szCs w:val="20"/>
               </w:rPr>
-              <w:t xml:space="preserve">Version del documento</w:t>
+              <w:t xml:space="preserve">Versión del documento</w:t>
             </w:r>
           </w:p>
         </w:tc>
@@ -1832,7 +1832,7 @@
                 <w:sz w:val="20"/>
                 <w:szCs w:val="20"/>
               </w:rPr>
-              <w:t xml:space="preserve">Clasificacion</w:t>
+              <w:t xml:space="preserve">Clasificación</w:t>
             </w:r>
           </w:p>
         </w:tc>
@@ -1911,7 +1911,7 @@
           <w:sz w:val="20"/>
           <w:szCs w:val="20"/>
         </w:rPr>
-        <w:t xml:space="preserve">La Universidad Peruana Union (UPeU) gestiona actualmente 35.970 identidades digitales distribuidas en tres campus (Lima, Juliaca y Tarapoto), con 7 sistemas institucionales criticos que operaban sin un modelo centralizado de identidad, acceso ni ciclo de vida de cuentas.</w:t>
+        <w:t xml:space="preserve">La Universidad Peruana Unión (UPeU) gestiona actualmente 35.970 identidades digitales distribuidas en tres campus (Lima, Juliaca y Tarapoto), con 7 sistemas institucionales críticos que operaban sin un modelo centralizado de identidad, acceso ni ciclo de vida de cuentas.</w:t>
       </w:r>
     </w:p>
     <w:p>
@@ -1930,7 +1930,7 @@
           <w:sz w:val="20"/>
           <w:szCs w:val="20"/>
         </w:rPr>
-        <w:t xml:space="preserve">El presente proyecto, de codigo DTI-IGA-2026-001, establece una plataforma de Identity Governance &amp; Administration (IGA) basada en MidPoint 4.10.2 — plataforma open source certificada y con respaldo de Evolveum. A traves de esta plataforma, DTI ha unificado las fuentes de datos de identidad (Oracle LAMB ERP, Microsoft Entra ID, OpenLDAP, Koha), automatizado el ciclo de vida joiner-mover-leaver y provisionado cuentas en los sistemas integrados de forma trazable y auditada.</w:t>
+        <w:t xml:space="preserve">El presente proyecto, de código DTI-IGA-2026-001, establece una plataforma de Identity Governance &amp; Administration (IGA) basada en MidPoint 4.10.2 — plataforma open source certificada y con respaldo de Evolveum. A través de esta plataforma, DTI ha unificado las fuentes de datos de identidad (Oracle LAMB ERP, Microsoft Entra ID, OpenLDAP, Koha), automatizado el ciclo de vida joiner-mover-leaver y provisionado cuentas en los sistemas integrados de forma trazable y auditada.</w:t>
       </w:r>
     </w:p>
     <w:p>
@@ -1949,7 +1949,7 @@
           <w:sz w:val="20"/>
           <w:szCs w:val="20"/>
         </w:rPr>
-        <w:t xml:space="preserve">A la fecha (mayo 2026), el sistema opera en produccion de forma estable: 34.551 identidades sincronizadas en el directorio OpenLDAP HA, 37.305 en Entra ID (solo lectura), 5.274 cuentas gestionadas en Koha, y un pipeline de reconciliacion automatico con reconocimiento de estados. La poblacion de egresados y trabajadores esta integrada de forma completa; la carga del padron estudiantil del ciclo regular vigente (aproximadamente 23.620 estudiantes) constituye la principal tarea pendiente de la siguiente fase. El costo total de software adicional es cero (S/ 0), dado que toda la pila tecnologica es open source o ya esta licenciada institucionalmente.</w:t>
+        <w:t xml:space="preserve">A la fecha (mayo 2026), el sistema opera en produccion de forma estable: 34.551 identidades sincronizadas en el directorio OpenLDAP HA, 37.305 en Entra ID (solo lectura), 5.274 cuentas gestionadas en Koha, y un pipeline de reconciliación automático con reconocimiento de estados. La poblacion de egresados y trabajadores está integrada de forma completa; la carga del padrón estudiantil del ciclo regular vigente (aproximadamente 23.620 estudiantes) constituye la principal tarea pendiente de la siguiente fase. El costo total de software adicional es cero (S/ 0), dado que toda la pila tecnológica es open source o ya está licenciada institucionalmente.</w:t>
       </w:r>
     </w:p>
     <w:p>
@@ -1968,7 +1968,7 @@
           <w:sz w:val="20"/>
           <w:szCs w:val="20"/>
         </w:rPr>
-        <w:t xml:space="preserve">El proyecto cumple con la Ley Universitaria 30220, la Ley de Proteccion de Datos 29733, los lineamientos SUNEDU y SINEACE para acreditacion, y los estandares internacionales ISO/IEC 27001:2022 e ISO/IEC 24760. Su culminacion habilitara a DTI para gestionar el ciclo de vida de identidades de forma automatica, reducir la superficie de ataque por cuentas huerfanas y demostrar controles de acceso ante auditores externos.</w:t>
+        <w:t xml:space="preserve">El proyecto cumple con la Ley Universitaria 30220, la Ley de Protección de Datos 29733, los lineamientos SUNEDU y SINEACE para acreditación, y los estándares internacionales ISO/IEC 27001:2022 e ISO/IEC 24760. Su culminación habilitará a DTI para gestionar el ciclo de vida de identidades de forma automática, reducir la superficie de ataque por cuentas huérfanas y demostrar controles de acceso ante auditores externos.</w:t>
       </w:r>
     </w:p>
     <w:p>
@@ -1987,7 +1987,7 @@
           <w:sz w:val="20"/>
           <w:szCs w:val="20"/>
         </w:rPr>
-        <w:t xml:space="preserve">Se solicita la aprobacion formal del Director DTI para continuar con las fases pendientes (RBAC completo, validacion end-to-end, gobierno Entra ID y metricas COUNTER) y formalizar los recursos asignados.</w:t>
+        <w:t xml:space="preserve">Se solicita la aprobación formal del Director DTI para continuar con las fases pendientes (RBAC completo, validación end-to-end, gobierno Entra ID y métricas COUNTER) y formalizar los recursos asignados.</w:t>
       </w:r>
     </w:p>
     <w:p>
@@ -2004,7 +2004,7 @@
           <w:sz w:val="36"/>
           <w:szCs w:val="36"/>
         </w:rPr>
-        <w:t xml:space="preserve">1. Antecedentes y Situacion Actual</w:t>
+        <w:t xml:space="preserve">1. Antecedentes y Situación Actual</w:t>
       </w:r>
     </w:p>
     <w:p>
@@ -2039,7 +2039,7 @@
           <w:sz w:val="20"/>
           <w:szCs w:val="20"/>
         </w:rPr>
-        <w:t xml:space="preserve">La UPeU es una institucion de educacion superior adventista con presencia en tres campus: Lima (sede central), Juliaca (region andina) y Tarapoto (region amazonica). Su comunidad academica, verificada contra la base de datos institucional Oracle LAMB en mayo de 2026, comprende alrededor de 24.000 estudiantes con matricula vigente en el año academico 2026 (23.620 en el ciclo regular vigente), 30.635 egresados y aproximadamente 3.800 trabajadores activos, de los cuales cerca de 1.190 son docentes universitarios y el resto personal administrativo y operativo.</w:t>
+        <w:t xml:space="preserve">La UPeU es una institucion de educacion superior adventista con presencia en tres campus: Lima (sede central), Juliaca (región andina) y Tarapoto (región amazonica). Su comunidad académica, verificada contra la base de datos institucional Oracle LAMB en mayo de 2026, comprende alrededor de 24.000 estudiantes con matrícula vigente en el año académico 2026 (23.620 en el ciclo regular vigente), 30.635 egresados y aproximadamente 3.800 trabajadores activos, de los cuales cerca de 1.190 son docentes universitarios y el resto personal administrativo y operativo.</w:t>
       </w:r>
     </w:p>
     <w:p>
@@ -2058,7 +2058,7 @@
           <w:sz w:val="20"/>
           <w:szCs w:val="20"/>
         </w:rPr>
-        <w:t xml:space="preserve">La base de datos institucional de verdad es Oracle LAMB — un ERP propio desarrollado sobre Oracle 11g con cuatro esquemas principales: MOISES (recursos humanos), DAVID (academico), ELISEO (estructura organizacional) y JOSUE (finanzas). LAMB es la fuente autoritativa de toda identidad activa en UPeU.</w:t>
+        <w:t xml:space="preserve">La base de datos institucional de verdad es Oracle LAMB — un ERP propio desarrollado sobre Oracle 11g con cuatro esquemas principales: MOISES (recursos humanos), DAVID (académico), ELISEO (estructura organizacional) y JOSUE (finanzas). LAMB es la fuente autoritativa de toda identidad activa en UPeU.</w:t>
       </w:r>
     </w:p>
     <w:p>
@@ -2077,7 +2077,7 @@
           <w:sz w:val="20"/>
           <w:szCs w:val="20"/>
         </w:rPr>
-        <w:t xml:space="preserve">Los sistemas institucionales que dependen de cuentas de usuario incluyen: Microsoft 365 (correo, Teams, OneDrive), Koha (sistema de biblioteca), Keycloak (SSO institucional), OpenLDAP (directorio de identidades), EJBCA (PKI corporativa), FreeRADIUS (Wi-Fi 802.1X) y repositorios academicos (DSpace, OJS).</w:t>
+        <w:t xml:space="preserve">Los sistemas institucionales que dependen de cuentas de usuario incluyen: Microsoft 365 (correo, Teams, OneDrive), Koha (sistema de biblioteca), Keycloak (SSO institucional), OpenLDAP (directorio de identidades), EJBCA (PKI corporativa), FreeRADIUS (Wi-Fi 802.1X) y repositorios académicos (DSpace, OJS).</w:t>
       </w:r>
     </w:p>
     <w:p>
@@ -2112,7 +2112,7 @@
           <w:sz w:val="20"/>
           <w:szCs w:val="20"/>
         </w:rPr>
-        <w:t xml:space="preserve">Antes del inicio de este proyecto, la situacion era la siguiente:</w:t>
+        <w:t xml:space="preserve">Antes del inicio de este proyecto, la situación era la siguiente:</w:t>
       </w:r>
     </w:p>
     <w:p>
@@ -2131,7 +2131,7 @@
           <w:sz w:val="20"/>
           <w:szCs w:val="20"/>
         </w:rPr>
-        <w:t xml:space="preserve">No existia un modelo centralizado de identidad institucional. Cada sistema administraba sus propias cuentas de forma aislada.</w:t>
+        <w:t xml:space="preserve">No existía un modelo centralizado de identidad institucional. Cada sistema administraba sus propias cuentas de forma aislada.</w:t>
       </w:r>
     </w:p>
     <w:p>
@@ -2150,7 +2150,7 @@
           <w:sz w:val="20"/>
           <w:szCs w:val="20"/>
         </w:rPr>
-        <w:t xml:space="preserve">La creacion de cuentas fue manual hasta cierto momento y posteriormente se automatizo; sin embargo, el mantenimiento del ciclo de vida (modificaciones y bajas) sigue dependiendo de solicitudes por correo o por sistema de tickets sin SLA definido.</w:t>
+        <w:t xml:space="preserve">La creación de cuentas fue manual hasta cierto momento y posteriormente se automatizó; sin embargo, el mantenimiento del ciclo de vida (modificaciones y bajas) sigue dependiendo de solicitudes por correo o por sistema de tickets sin SLA definido.</w:t>
       </w:r>
     </w:p>
     <w:p>
@@ -2169,7 +2169,7 @@
           <w:sz w:val="20"/>
           <w:szCs w:val="20"/>
         </w:rPr>
-        <w:t xml:space="preserve">Cuando un trabajador terminaba su contrato o un estudiante concluia su ciclo, sus cuentas no se desactivaban automaticamente en los sistemas destino, generando cuentas huerfanas que representan un riesgo de seguridad (ISO 27001 A.5.15, A.8.2).</w:t>
+        <w:t xml:space="preserve">Cuando un trabajador terminaba su contrato o un estudiante concluía su ciclo, sus cuentas no se desactivaban automáticamente en los sistemas destino, generando cuentas huérfanas que representan un riesgo de seguridad (ISO 27001 A.5.15, A.8.2).</w:t>
       </w:r>
     </w:p>
     <w:p>
@@ -2188,7 +2188,7 @@
           <w:sz w:val="20"/>
           <w:szCs w:val="20"/>
         </w:rPr>
-        <w:t xml:space="preserve">No habia trazabilidad de quienes tenian acceso a que sistemas, ni evidencia auditable de los cambios.</w:t>
+        <w:t xml:space="preserve">No había trazabilidad de quienes tenían acceso a que sistemas, ni evidencia auditable de los cambios.</w:t>
       </w:r>
     </w:p>
     <w:p>
@@ -2207,7 +2207,7 @@
           <w:sz w:val="20"/>
           <w:szCs w:val="20"/>
         </w:rPr>
-        <w:t xml:space="preserve">El proceso de alta de un docente nuevo podia tardar dias o semanas en propagarse a todos los sistemas que necesitaba.</w:t>
+        <w:t xml:space="preserve">El proceso de alta de un docente nuevo podía tardar días o semanas en propagarse a todos los sistemas que necesitaba.</w:t>
       </w:r>
     </w:p>
     <w:p>
@@ -2226,7 +2226,7 @@
           <w:sz w:val="20"/>
           <w:szCs w:val="20"/>
         </w:rPr>
-        <w:t xml:space="preserve">Las licencias M365 se asignaban manualmente sin reglas automaticas basadas en el tipo de vinculo institucional.</w:t>
+        <w:t xml:space="preserve">Las licencias M365 se asignaban manualmente sin reglas automáticas basadas en el tipo de vínculo institucional.</w:t>
       </w:r>
     </w:p>
     <w:p>
@@ -2548,7 +2548,7 @@
                 <w:sz w:val="18"/>
                 <w:szCs w:val="18"/>
               </w:rPr>
-              <w:t xml:space="preserve">Sin evidencia auditable de asignacion de permisos para SUNEDU/SINEACE</w:t>
+              <w:t xml:space="preserve">Sin evidencia auditable de asignación de permisos para SUNEDU/SINEACE</w:t>
             </w:r>
           </w:p>
         </w:tc>
@@ -2762,7 +2762,7 @@
                 <w:sz w:val="18"/>
                 <w:szCs w:val="18"/>
               </w:rPr>
-              <w:t xml:space="preserve">Sin control de separacion de funciones (SoD) documentado</w:t>
+              <w:t xml:space="preserve">Sin control de separación de funciones (SoD) documentado</w:t>
             </w:r>
           </w:p>
         </w:tc>
@@ -2869,7 +2869,7 @@
                 <w:sz w:val="18"/>
                 <w:szCs w:val="18"/>
               </w:rPr>
-              <w:t xml:space="preserve">Acceso por defecto sin principio de minimo privilegio</w:t>
+              <w:t xml:space="preserve">Acceso por defecto sin principio de mínimo privilegio</w:t>
             </w:r>
           </w:p>
         </w:tc>
@@ -3134,7 +3134,7 @@
                 <w:sz w:val="18"/>
                 <w:szCs w:val="18"/>
               </w:rPr>
-              <w:t xml:space="preserve">Transparencia en gestion y rendicion de cuentas. Registro de docentes y administrativos con evidencia.</w:t>
+              <w:t xml:space="preserve">Transparencia en gestión y rendición de cuentas. Registro de docentes y administrativos con evidencia.</w:t>
             </w:r>
           </w:p>
         </w:tc>
@@ -3169,7 +3169,7 @@
                 <w:sz w:val="18"/>
                 <w:szCs w:val="18"/>
               </w:rPr>
-              <w:t xml:space="preserve">Trazabilidad completa de asignacion de cuentas y roles por tipo de vinculo.</w:t>
+              <w:t xml:space="preserve">Trazabilidad completa de asignación de cuentas y roles por tipo de vínculo.</w:t>
             </w:r>
           </w:p>
         </w:tc>
@@ -3241,7 +3241,7 @@
                 <w:sz w:val="18"/>
                 <w:szCs w:val="18"/>
               </w:rPr>
-              <w:t xml:space="preserve">Tratamiento licito, seguro y con acceso minimo de datos personales (Art. 9, 13).</w:t>
+              <w:t xml:space="preserve">Tratamiento licito, seguro y con acceso mínimo de datos personales (Art. 9, 13).</w:t>
             </w:r>
           </w:p>
         </w:tc>
@@ -3276,7 +3276,7 @@
                 <w:sz w:val="18"/>
                 <w:szCs w:val="18"/>
               </w:rPr>
-              <w:t xml:space="preserve">Principio de minimo privilegio via RBAC. Registro de acceso a datos.</w:t>
+              <w:t xml:space="preserve">Principio de mínimo privilegio vía RBAC. Registro de acceso a datos.</w:t>
             </w:r>
           </w:p>
         </w:tc>
@@ -3348,7 +3348,7 @@
                 <w:sz w:val="18"/>
                 <w:szCs w:val="18"/>
               </w:rPr>
-              <w:t xml:space="preserve">Politica Nacional de Gobierno e Integridad. Seguridad de la informacion en entidades educativas.</w:t>
+              <w:t xml:space="preserve">Política Nacional de Gobierno e Integridad. Seguridad de la información en entidades educativas.</w:t>
             </w:r>
           </w:p>
         </w:tc>
@@ -3455,7 +3455,7 @@
                 <w:sz w:val="18"/>
                 <w:szCs w:val="18"/>
               </w:rPr>
-              <w:t xml:space="preserve">Verificacion de identidad para acceso a sistemas publicos (DNI biometrico).</w:t>
+              <w:t xml:space="preserve">Verificacion de identidad para acceso a sistemas públicos (DNI biométrico).</w:t>
             </w:r>
           </w:p>
         </w:tc>
@@ -3490,7 +3490,7 @@
                 <w:sz w:val="18"/>
                 <w:szCs w:val="18"/>
               </w:rPr>
-              <w:t xml:space="preserve">DNI como correlador canonico (schacPersonalUniqueID). IAL2 en acceso a sistemas criticos.</w:t>
+              <w:t xml:space="preserve">DNI como correlador canónico (schacPersonalUniqueID). IAL2 en acceso a sistemas críticos.</w:t>
             </w:r>
           </w:p>
         </w:tc>
@@ -3527,7 +3527,7 @@
                 <w:sz w:val="18"/>
                 <w:szCs w:val="18"/>
               </w:rPr>
-              <w:t xml:space="preserve">SUNEDU — Condiciones Basicas de Calidad (CBC)</w:t>
+              <w:t xml:space="preserve">SUNEDU — Condiciones Básicas de Calidad (CBC)</w:t>
             </w:r>
           </w:p>
         </w:tc>
@@ -3562,7 +3562,7 @@
                 <w:sz w:val="18"/>
                 <w:szCs w:val="18"/>
               </w:rPr>
-              <w:t xml:space="preserve">Dimension 5: docentes con perfil acreditado. Control de acceso a sistemas academicos.</w:t>
+              <w:t xml:space="preserve">Dimensión 5: docentes con perfil acreditado. Control de acceso a sistemas académicos.</w:t>
             </w:r>
           </w:p>
         </w:tc>
@@ -3634,7 +3634,7 @@
                 <w:sz w:val="18"/>
                 <w:szCs w:val="18"/>
               </w:rPr>
-              <w:t xml:space="preserve">SINEACE — Estandares de Acreditacion</w:t>
+              <w:t xml:space="preserve">SINEACE — Estándares de Acreditación</w:t>
             </w:r>
           </w:p>
         </w:tc>
@@ -3669,7 +3669,7 @@
                 <w:sz w:val="18"/>
                 <w:szCs w:val="18"/>
               </w:rPr>
-              <w:t xml:space="preserve">Proceso 5.4: gestion de recursos humanos con evidencia de competencias y acceso.</w:t>
+              <w:t xml:space="preserve">Proceso 5.4: gestión de recursos humanos con evidencia de competencias y acceso.</w:t>
             </w:r>
           </w:p>
         </w:tc>
@@ -3704,7 +3704,7 @@
                 <w:sz w:val="18"/>
                 <w:szCs w:val="18"/>
               </w:rPr>
-              <w:t xml:space="preserve">Object templates + lifecycle automatico documentado en repositorio GitOps.</w:t>
+              <w:t xml:space="preserve">Object templates + lifecycle automático documentado en repositorio GitOps.</w:t>
             </w:r>
           </w:p>
         </w:tc>
@@ -3728,7 +3728,7 @@
           <w:sz w:val="28"/>
           <w:szCs w:val="28"/>
         </w:rPr>
-        <w:t xml:space="preserve">2.2 Estandares internacionales adoptados</w:t>
+        <w:t xml:space="preserve">2.2 Estándares internacionales adoptados</w:t>
       </w:r>
     </w:p>
     <w:tbl>
@@ -3780,7 +3780,7 @@
                 <w:sz w:val="20"/>
                 <w:szCs w:val="20"/>
               </w:rPr>
-              <w:t xml:space="preserve">Estandar</w:t>
+              <w:t xml:space="preserve">Estándar</w:t>
             </w:r>
           </w:p>
         </w:tc>
@@ -3815,7 +3815,7 @@
                 <w:sz w:val="20"/>
                 <w:szCs w:val="20"/>
               </w:rPr>
-              <w:t xml:space="preserve">Version</w:t>
+              <w:t xml:space="preserve">Versión</w:t>
             </w:r>
           </w:p>
         </w:tc>
@@ -3850,7 +3850,7 @@
                 <w:sz w:val="20"/>
                 <w:szCs w:val="20"/>
               </w:rPr>
-              <w:t xml:space="preserve">Aplicacion en este proyecto</w:t>
+              <w:t xml:space="preserve">Aplicación en este proyecto</w:t>
             </w:r>
           </w:p>
         </w:tc>
@@ -3957,7 +3957,7 @@
                 <w:sz w:val="18"/>
                 <w:szCs w:val="18"/>
               </w:rPr>
-              <w:t xml:space="preserve">Terminologia IGA (identity, attribute, IIA, lifecycle). Marco conceptual del modelo canonico.</w:t>
+              <w:t xml:space="preserve">Terminologia IGA (identity, attribute, IIA, lifecycle). Marco conceptual del modelo canónico.</w:t>
             </w:r>
           </w:p>
         </w:tc>
@@ -4064,7 +4064,7 @@
                 <w:sz w:val="18"/>
                 <w:szCs w:val="18"/>
               </w:rPr>
-              <w:t xml:space="preserve">Controles A.5.15 (acceso), A.5.16 (identidad), A.5.17 (credenciales), A.5.18 (derechos), A.8.2 (privilegios), A.8.3 (minimo acceso).</w:t>
+              <w:t xml:space="preserve">Controles A.5.15 (acceso), A.5.16 (identidad), A.5.17 (credenciales), A.5.18 (derechos), A.8.2 (privilegios), A.8.3 (mínimo acceso).</w:t>
             </w:r>
           </w:p>
         </w:tc>
@@ -4385,7 +4385,7 @@
                 <w:sz w:val="18"/>
                 <w:szCs w:val="18"/>
               </w:rPr>
-              <w:t xml:space="preserve">Atributos academicos: schacHomeOrganization, schacPersonalUniqueID (DNI en URN), schacExpiryDate.</w:t>
+              <w:t xml:space="preserve">Atributos académicos: schacHomeOrganization, schacPersonalUniqueID (DNI en URN), schacExpiryDate.</w:t>
             </w:r>
           </w:p>
         </w:tc>
@@ -4492,7 +4492,7 @@
                 <w:sz w:val="18"/>
                 <w:szCs w:val="18"/>
               </w:rPr>
-              <w:t xml:space="preserve">Modelo user/group core + Enterprise extension. Base del schema canonico.</w:t>
+              <w:t xml:space="preserve">Modelo user/group core + Enterprise extension. Base del schema canónico.</w:t>
             </w:r>
           </w:p>
         </w:tc>
@@ -4706,7 +4706,7 @@
                 <w:sz w:val="18"/>
                 <w:szCs w:val="18"/>
               </w:rPr>
-              <w:t xml:space="preserve">Bundle de atributos eduPerson para federacion con Scopus, EBSCO, Web of Science, IEEE.</w:t>
+              <w:t xml:space="preserve">Bundle de atributos eduPerson para federación con Scopus, EBSCO, Web of Science, IEEE.</w:t>
             </w:r>
           </w:p>
         </w:tc>
@@ -4744,7 +4744,7 @@
           <w:sz w:val="20"/>
           <w:szCs w:val="20"/>
         </w:rPr>
-        <w:t xml:space="preserve">El incumplimiento de los marcos anteriores puede derivar en: (a) observaciones criticas en procesos de licenciamiento o acreditacion SUNEDU/SINEACE por ausencia de controles de acceso documentados; (b) sanciones bajo la Ley 29733 ante incidentes de filtracion de datos personales sin evidencia de tratamiento licito; y (c) riesgos de seguridad materializados por cuentas huerfanas o sin control de separacion de funciones. El proyecto IGA elimina de forma sistematica estos riesgos.</w:t>
+        <w:t xml:space="preserve">El incumplimiento de los marcos anteriores puede derivar en: (a) observaciones críticas en procesos de licenciamiento o acreditación SUNEDU/SINEACE por ausencia de controles de acceso documentados; (b) sanciones bajo la Ley 29733 ante incidentes de filtración de datos personales sin evidencia de tratamiento licito; y (c) riesgos de seguridad materializados por cuentas huérfanas o sin control de separación de funciones. El proyecto IGA elimina de forma sistemática estos riesgos.</w:t>
       </w:r>
     </w:p>
     <w:p>
@@ -4761,7 +4761,7 @@
           <w:sz w:val="36"/>
           <w:szCs w:val="36"/>
         </w:rPr>
-        <w:t xml:space="preserve">3. Justificacion del Proyecto</w:t>
+        <w:t xml:space="preserve">3. Justificación del Proyecto</w:t>
       </w:r>
     </w:p>
     <w:p>
@@ -4796,7 +4796,7 @@
           <w:sz w:val="20"/>
           <w:szCs w:val="20"/>
         </w:rPr>
-        <w:t xml:space="preserve">La UPeU ha crecido sostenidamente en los ultimos años, incorporando nuevos programas de pregrado y posgrado y herramientas digitales (M365, ecosistema LAMB, Koha, EJBCA, Wi-Fi 802.1X). Este crecimiento ha presionado al equipo DTI a gestionar identidades manualmente en cada sistema, sin visibilidad transversal ni automatizacion del ciclo de vida. La plataforma IGA resuelve estructuralmente este problema sin costo adicional de licencias.</w:t>
+        <w:t xml:space="preserve">La UPeU ha crecido sostenidamente en los últimos años, incorporando nuevos programas de pregrado y posgrado y herramientas digitales (M365, ecosistema LAMB, Koha, EJBCA, Wi-Fi 802.1X). Este crecimiento ha presionado al equipo DTI a gestionar identidades manualmente en cada sistema, sin visibilidad transversal ni automatización del ciclo de vida. La plataforma IGA resuelve estructuralmente este problema sin costo adicional de licencias.</w:t>
       </w:r>
     </w:p>
     <w:p>
@@ -4812,7 +4812,7 @@
           <w:sz w:val="28"/>
           <w:szCs w:val="28"/>
         </w:rPr>
-        <w:t xml:space="preserve">3.2 Analisis de alternativas</w:t>
+        <w:t xml:space="preserve">3.2 Análisis de alternativas</w:t>
       </w:r>
     </w:p>
     <w:tbl>
@@ -4935,7 +4935,7 @@
                 <w:sz w:val="20"/>
                 <w:szCs w:val="20"/>
               </w:rPr>
-              <w:t xml:space="preserve">Tiempo de implementacion</w:t>
+              <w:t xml:space="preserve">Tiempo de implementación</w:t>
             </w:r>
           </w:p>
         </w:tc>
@@ -5538,7 +5538,7 @@
                 <w:sz w:val="18"/>
                 <w:szCs w:val="18"/>
               </w:rPr>
-              <w:t xml:space="preserve">Riesgo de calidad. Sin estandar. Deuda tecnica alta.</w:t>
+              <w:t xml:space="preserve">Riesgo de calidad. Sin estándar. Deuda técnica alta.</w:t>
             </w:r>
           </w:p>
         </w:tc>
@@ -5680,7 +5680,7 @@
                 <w:sz w:val="18"/>
                 <w:szCs w:val="18"/>
               </w:rPr>
-              <w:t xml:space="preserve">Estandar internacional. Soporte Evolveum. Stack open source alineado con politica UPeU.</w:t>
+              <w:t xml:space="preserve">Estándar internacional. Soporte Evolveum. Stack open source alineado con política UPeU.</w:t>
             </w:r>
           </w:p>
         </w:tc>
@@ -5704,7 +5704,7 @@
           <w:sz w:val="28"/>
           <w:szCs w:val="28"/>
         </w:rPr>
-        <w:t xml:space="preserve">3.3 Valor estrategico</w:t>
+        <w:t xml:space="preserve">3.3 Valor estratégico</w:t>
       </w:r>
     </w:p>
     <w:p>
@@ -5723,7 +5723,7 @@
           <w:sz w:val="20"/>
           <w:szCs w:val="20"/>
         </w:rPr>
-        <w:t xml:space="preserve">Habilitador de acreditacion: los controles IGA son evidencia directa para indicadores SUNEDU CBC (Dimension 5) y SINEACE (Estandar 5.4).</w:t>
+        <w:t xml:space="preserve">Habilitador de acreditación: los controles IGA son evidencia directa para indicadores SUNEDU CBC (Dimensión 5) y SINEACE (Estándar 5.4).</w:t>
       </w:r>
     </w:p>
     <w:p>
@@ -5742,7 +5742,7 @@
           <w:sz w:val="20"/>
           <w:szCs w:val="20"/>
         </w:rPr>
-        <w:t xml:space="preserve">Arquitectura mantenible: el diseño en capas separa el modelo canonico basado en estandares internacionales de las particularidades institucionales de UPeU, lo que facilita el mantenimiento, las auditorias y la evolucion futura del sistema.</w:t>
+        <w:t xml:space="preserve">Arquitectura mantenible: el diseño en capas separa el modelo canónico basado en estándares internacionales de las particularidades institucionales de UPeU, lo que facilita el mantenimiento, las auditorías y la evolución futura del sistema.</w:t>
       </w:r>
     </w:p>
     <w:p>
@@ -5761,7 +5761,7 @@
           <w:sz w:val="20"/>
           <w:szCs w:val="20"/>
         </w:rPr>
-        <w:t xml:space="preserve">Seguridad por diseno: elimina cuentas huerfanas sistematicamente, reduce superficie de ataque y permite demostracion de controles ante auditores ISO 27001.</w:t>
+        <w:t xml:space="preserve">Seguridad por diseño: elimina cuentas huérfanas sistemáticamente, reduce superficie de ataque y permite demostración de controles ante auditores ISO 27001.</w:t>
       </w:r>
     </w:p>
     <w:p>
@@ -5780,7 +5780,7 @@
           <w:sz w:val="20"/>
           <w:szCs w:val="20"/>
         </w:rPr>
-        <w:t xml:space="preserve">Autonomia tecnologica: sin dependencia de proveedor externo. DTI controla completamente el ciclo de vida de identidades.</w:t>
+        <w:t xml:space="preserve">Autonomía tecnológica: sin dependencia de proveedor externo. DTI controla completamente el ciclo de vida de identidades.</w:t>
       </w:r>
     </w:p>
     <w:p>
@@ -5832,7 +5832,7 @@
           <w:sz w:val="20"/>
           <w:szCs w:val="20"/>
         </w:rPr>
-        <w:t xml:space="preserve">Establecer y operar una plataforma de Identity Governance &amp; Administration (IGA) sobre MidPoint 4.10.2 que centralice la gestion del ciclo de vida de identidades de la UPeU — desde el ingreso hasta el egreso o cese — automatizando el aprovisionamiento de cuentas y permisos en los sistemas institucionales de los tres campus, con trazabilidad completa y conformidad con ISO 27001:2022 e ISO 24760.</w:t>
+        <w:t xml:space="preserve">Establecer y operar una plataforma de Identity Governance &amp; Administration (IGA) sobre MidPoint 4.10.2 que centralice la gestión del ciclo de vida de identidades de la UPeU — desde el ingreso hasta el egreso o cese — automatizando el aprovisionamiento de cuentas y permisos en los sistemas institucionales de los tres campus, con trazabilidad completa y conformidad con ISO 27001:2022 e ISO 24760.</w:t>
       </w:r>
     </w:p>
     <w:p>
@@ -5848,7 +5848,7 @@
           <w:sz w:val="28"/>
           <w:szCs w:val="28"/>
         </w:rPr>
-        <w:t xml:space="preserve">4.2 Objetivos especificos</w:t>
+        <w:t xml:space="preserve">4.2 Objetivos específicos</w:t>
       </w:r>
     </w:p>
     <w:p>
@@ -5867,7 +5867,7 @@
           <w:sz w:val="20"/>
           <w:szCs w:val="20"/>
         </w:rPr>
-        <w:t xml:space="preserve">OE1. Centralizar y normalizar las identidades institucionales (35.970 gestionadas a la fecha, sobre una poblacion objetivo cercana a 58.000 personas entre estudiantes, egresados y trabajadores) desde Oracle LAMB como fuente autoritativa, usando el modelo canonico eduPerson/SCHAC/SCIM.</w:t>
+        <w:t xml:space="preserve">OE1. Centralizar y normalizar las identidades institucionales (35.970 gestionadas a la fecha, sobre una poblacion objetivo cercana a 58.000 personas entre estudiantes, egresados y trabajadores) desde Oracle LAMB como fuente autoritativa, usando el modelo canónico eduPerson/SCHAC/SCIM.</w:t>
       </w:r>
     </w:p>
     <w:p>
@@ -5886,7 +5886,7 @@
           <w:sz w:val="20"/>
           <w:szCs w:val="20"/>
         </w:rPr>
-        <w:t xml:space="preserve">OE2. Automatizar el ciclo de vida joiner-mover-leaver: creacion, modificacion y desactivacion de cuentas en todos los sistemas integrados sin intervencion manual del personal DTI.</w:t>
+        <w:t xml:space="preserve">OE2. Automatizar el ciclo de vida joiner-mover-leaver: creación, modificacion y desactivacion de cuentas en todos los sistemas integrados sin intervención manual del personal DTI.</w:t>
       </w:r>
     </w:p>
     <w:p>
@@ -5905,7 +5905,7 @@
           <w:sz w:val="20"/>
           <w:szCs w:val="20"/>
         </w:rPr>
-        <w:t xml:space="preserve">OE3. Implementar un modelo RBAC en tres capas (Business Role -&gt; Application Role -&gt; Entitlement) que garantice el principio de minimo privilegio y separe funciones incompatibles (SoD), conforme a ISO 27001 A.8.2-A.8.3.</w:t>
+        <w:t xml:space="preserve">OE3. Implementar un modelo RBAC en tres capas (Business Role -&gt; Application Role -&gt; Entitlement) que garantice el principio de mínimo privilegio y separe funciones incompatibles (SoD), conforme a ISO 27001 A.8.2-A.8.3.</w:t>
       </w:r>
     </w:p>
     <w:p>
@@ -5924,7 +5924,7 @@
           <w:sz w:val="20"/>
           <w:szCs w:val="20"/>
         </w:rPr>
-        <w:t xml:space="preserve">OE4. Proveer un directorio OpenLDAP HA (N-Way Multimaster en dos nodos) como fuente federada de identidades para Keycloak, habilitando SSO con atributos eduPerson hacia bases de datos academicas (Scopus, EBSCO, Web of Science, IEEE).</w:t>
+        <w:t xml:space="preserve">OE4. Proveer un directorio OpenLDAP HA (N-Way Multimaster en dos nodos) como fuente federada de identidades para Keycloak, habilitando SSO con atributos eduPerson hacia bases de datos académicas (Scopus, EBSCO, Web of Science, IEEE).</w:t>
       </w:r>
     </w:p>
     <w:p>
@@ -5943,7 +5943,7 @@
           <w:sz w:val="20"/>
           <w:szCs w:val="20"/>
         </w:rPr>
-        <w:t xml:space="preserve">OE5. Sincronizar identidades con Microsoft Entra ID para gobernar licencias M365 (A1/A3/A5) segun archetype institucional, eliminando asignaciones manuales y licencias huerfanas.</w:t>
+        <w:t xml:space="preserve">OE5. Sincronizar identidades con Microsoft Entra ID para gobernar licencias M365 (A1/A3/A5) según archetype institucional, eliminando asignaciones manuales y licencias huérfanas.</w:t>
       </w:r>
     </w:p>
     <w:p>
@@ -5962,7 +5962,7 @@
           <w:sz w:val="20"/>
           <w:szCs w:val="20"/>
         </w:rPr>
-        <w:t xml:space="preserve">OE6. Producir evidencia auditable del ciclo de vida de identidades y control de acceso, utilizable en procesos de licenciamiento SUNEDU, acreditacion SINEACE y auditorias ISO 27001.</w:t>
+        <w:t xml:space="preserve">OE6. Producir evidencia auditable del ciclo de vida de identidades y control de acceso, utilizable en procesos de licenciamiento SUNEDU, acreditación SINEACE y auditorías ISO 27001.</w:t>
       </w:r>
     </w:p>
     <w:p>
@@ -5981,7 +5981,7 @@
           <w:sz w:val="20"/>
           <w:szCs w:val="20"/>
         </w:rPr>
-        <w:t xml:space="preserve">OE7. Establecer metricas COUNTER 5 de uso de bases de datos academicas con granularidad por facultad y programa academico, habilitando decision informada en renovacion de suscripciones.</w:t>
+        <w:t xml:space="preserve">OE7. Establecer métricas COUNTER 5 de uso de bases de datos académicas con granularidad por facultad y programa académico, habilitando decisión informada en renovación de suscripciones.</w:t>
       </w:r>
     </w:p>
     <w:p>
@@ -6033,7 +6033,7 @@
           <w:sz w:val="20"/>
           <w:szCs w:val="20"/>
         </w:rPr>
-        <w:t xml:space="preserve">Gestion de identidades de los 4 arquetipos activos en MidPoint: egresados (30.543), personal administrativo (3.144), docentes (135) y estudiantes (1.679 cargados del ciclo Verano 2026; la carga del padron del ciclo regular completo es una tarea pendiente priorizada).</w:t>
+        <w:t xml:space="preserve">Gestión de identidades de los 4 arquetipos activos en MidPoint: egresados (30.543), personal administrativo (3.144), docentes (135) y estudiantes (1.679 cargados del ciclo Verano 2026; la carga del padrón del ciclo regular completo es una tarea pendiente priorizada).</w:t>
       </w:r>
     </w:p>
     <w:p>
@@ -6071,7 +6071,7 @@
           <w:sz w:val="20"/>
           <w:szCs w:val="20"/>
         </w:rPr>
-        <w:t xml:space="preserve">Modelo RBAC con roles de negocio, aplicacion y atributos eduPerson/SCHAC para federacion SSO.</w:t>
+        <w:t xml:space="preserve">Modelo RBAC con roles de negocio, aplicación y atributos eduPerson/SCHAC para federación SSO.</w:t>
       </w:r>
     </w:p>
     <w:p>
@@ -6090,7 +6090,7 @@
           <w:sz w:val="20"/>
           <w:szCs w:val="20"/>
         </w:rPr>
-        <w:t xml:space="preserve">Pipeline automatico de sincronizacion: Trigger Scanner (5 min), Validity Scanner (15 min), Reconcile LAMB (02:00 UTC diario).</w:t>
+        <w:t xml:space="preserve">Pipeline automático de sincronización: Trigger Scanner (5 min), Validity Scanner (15 min), Reconcile LAMB (02:00 UTC diario).</w:t>
       </w:r>
     </w:p>
     <w:p>
@@ -6109,7 +6109,7 @@
           <w:sz w:val="20"/>
           <w:szCs w:val="20"/>
         </w:rPr>
-        <w:t xml:space="preserve">Gobierno Entra ID: estructura de Administrative Units por campus/sede, asignacion automatica de licencias M365 por archetype.</w:t>
+        <w:t xml:space="preserve">Gobierno Entra ID: estructura de Administrative Units por campus/sede, asignación automática de licencias M365 por archetype.</w:t>
       </w:r>
     </w:p>
     <w:p>
@@ -6128,7 +6128,7 @@
           <w:sz w:val="20"/>
           <w:szCs w:val="20"/>
         </w:rPr>
-        <w:t xml:space="preserve">Metricas COUNTER 5: harvest SUSHI de Scopus, EBSCO, Web of Science, IEEE Xplore, ProQuest.</w:t>
+        <w:t xml:space="preserve">Métricas COUNTER 5: harvest SUSHI de Scopus, EBSCO, Web of Science, IEEE Xplore, ProQuest.</w:t>
       </w:r>
     </w:p>
     <w:p>
@@ -6147,7 +6147,7 @@
           <w:sz w:val="20"/>
           <w:szCs w:val="20"/>
         </w:rPr>
-        <w:t xml:space="preserve">Repositorio GitOps (github.com/UPeU-Infra/midPointEcosystem) como fuente de verdad de toda la configuracion IGA.</w:t>
+        <w:t xml:space="preserve">Repositorio GitOps (github.com/UPeU-Infra/midPointEcosystem) como fuente de verdad de toda la configuración IGA.</w:t>
       </w:r>
     </w:p>
     <w:p>
@@ -6187,7 +6187,7 @@
           <w:sz w:val="20"/>
           <w:szCs w:val="20"/>
         </w:rPr>
-        <w:t xml:space="preserve">El Active Directory UPeU actual (192.168.13.150 / lim.upeu.edu.pe) no se incluye en este proyecto. Esta mal estructurado y no tiene cobertura global. Una decision sobre AD nuevo se tomara en Fase 12 si Entra ID no cubre todos los casos de uso.</w:t>
+        <w:t xml:space="preserve">El Active Directory UPeU actual (192.168.13.150 / lim.upeu.edu.pe) no se incluye en este proyecto. Está mal estructurado y no tiene cobertura global. Una decisión sobre AD nuevo se tomará en Fase 12 si Entra ID no cubre todos los casos de uso.</w:t>
       </w:r>
     </w:p>
     <w:p>
@@ -6263,7 +6263,7 @@
           <w:sz w:val="20"/>
           <w:szCs w:val="20"/>
         </w:rPr>
-        <w:t xml:space="preserve">Sistemas de terceros sin API de aprovisionamiento estandar (SCIM/REST/LDAP).</w:t>
+        <w:t xml:space="preserve">Sistemas de terceros sin API de aprovisionamiento estándar (SCIM/REST/LDAP).</w:t>
       </w:r>
     </w:p>
     <w:p>
@@ -6402,7 +6402,7 @@
                 <w:sz w:val="20"/>
                 <w:szCs w:val="20"/>
               </w:rPr>
-              <w:t xml:space="preserve">Beneficio especifico</w:t>
+              <w:t xml:space="preserve">Beneficio específico</w:t>
             </w:r>
           </w:p>
         </w:tc>
@@ -6439,7 +6439,7 @@
                 <w:sz w:val="18"/>
                 <w:szCs w:val="18"/>
               </w:rPr>
-              <w:t xml:space="preserve">Estudiantes con matricula vigente</w:t>
+              <w:t xml:space="preserve">Estudiantes con matrícula vigente</w:t>
             </w:r>
           </w:p>
         </w:tc>
@@ -6509,7 +6509,7 @@
                 <w:sz w:val="18"/>
                 <w:szCs w:val="18"/>
               </w:rPr>
-              <w:t xml:space="preserve">Cuenta institucional activa desde el primer dia de matricula. Acceso inmediato a M365, Koha, LDAP y sistemas academicos. Actualmente 1.679 cargados (ciclo Verano 2026); el resto se incorpora al completar la carga del ciclo regular.</w:t>
+              <w:t xml:space="preserve">Cuenta institucional activa desde el primer día de matrícula. Acceso inmediato a M365, Koha, LDAP y sistemas académicos. Actualmente 1.679 cargados (ciclo Verano 2026); el resto se incorpora al completar la carga del ciclo regular.</w:t>
             </w:r>
           </w:p>
         </w:tc>
@@ -6616,7 +6616,7 @@
                 <w:sz w:val="18"/>
                 <w:szCs w:val="18"/>
               </w:rPr>
-              <w:t xml:space="preserve">Alta automatica al registrarse en LAMB. Licencia M365 correcta por tipo de contrato (TC/TP). Acceso a bases cientificas via SSO SAML. Actualmente 135 clasificados como archetype faculty; el resto figura provisionalmente como staff (ver nota seccion 7.2).</w:t>
+              <w:t xml:space="preserve">Alta automática al registrarse en LAMB. Licencia M365 correcta por tipo de contrato (TC/TP). Acceso a bases científicas vía SSO SAML. Actualmente 135 clasificados como archetype faculty; el resto figura provisionalmente como staff (ver nota sección 7.2).</w:t>
             </w:r>
           </w:p>
         </w:tc>
@@ -6723,7 +6723,7 @@
                 <w:sz w:val="18"/>
                 <w:szCs w:val="18"/>
               </w:rPr>
-              <w:t xml:space="preserve">Acceso a sistemas segun funcion real. Desactivacion automatica al cese. Sin cuentas huerfanas que representen riesgo.</w:t>
+              <w:t xml:space="preserve">Acceso a sistemas según función real. Desactivacion automática al cese. Sin cuentas huérfanas que representen riesgo.</w:t>
             </w:r>
           </w:p>
         </w:tc>
@@ -6830,7 +6830,7 @@
                 <w:sz w:val="18"/>
                 <w:szCs w:val="18"/>
               </w:rPr>
-              <w:t xml:space="preserve">Correo alumni activo mientras figure en LAMB. Acceso al catalogo Koha y OPAC externo.</w:t>
+              <w:t xml:space="preserve">Correo alumni activo mientras figure en LAMB. Acceso al catálogo Koha y OPAC externo.</w:t>
             </w:r>
           </w:p>
         </w:tc>
@@ -6937,7 +6937,7 @@
                 <w:sz w:val="18"/>
                 <w:szCs w:val="18"/>
               </w:rPr>
-              <w:t xml:space="preserve">Eliminacion de tareas manuales repetitivas. Visibilidad completa de identidades. Evidencia para auditorias sin recoleccion adicional. Personal DTI distribuido en los tres campus (Lima 38, Juliaca 23, Tarapoto 11).</w:t>
+              <w:t xml:space="preserve">Eliminación de tareas manuales repetitivas. Visibilidad completa de identidades. Evidencia para auditorías sin recolección adicional. Personal DTI distribuido en los tres campus (Lima 38, Juliaca 23, Tarapoto 11).</w:t>
             </w:r>
           </w:p>
         </w:tc>
@@ -6974,7 +6974,7 @@
                 <w:sz w:val="18"/>
                 <w:szCs w:val="18"/>
               </w:rPr>
-              <w:t xml:space="preserve">Autoridades academicas (Decanos, Directores)</w:t>
+              <w:t xml:space="preserve">Autoridades académicas (Decanos, Directores)</w:t>
             </w:r>
           </w:p>
         </w:tc>
@@ -7044,7 +7044,7 @@
                 <w:sz w:val="18"/>
                 <w:szCs w:val="18"/>
               </w:rPr>
-              <w:t xml:space="preserve">Pueden delegar acceso a sistemas de sus unidades sin intervenir en la configuracion tecnica. Comprende 5 decanos de facultad, 13 directores de escuela profesional, 2 directores de filial y 7 directores de posgrado. Delegacion de administracion en Entra ID por AU (campus/sede).</w:t>
+              <w:t xml:space="preserve">Pueden delegar acceso a sistemas de sus unidades sin intervenir en la configuración técnica. Comprende 5 decanos de facultad, 13 directores de escuela profesional, 2 directores de filial y 7 directores de posgrado. Delegacion de administración en Entra ID por AU (campus/sede).</w:t>
             </w:r>
           </w:p>
         </w:tc>
@@ -7171,7 +7171,7 @@
           <w:sz w:val="36"/>
           <w:szCs w:val="36"/>
         </w:rPr>
-        <w:t xml:space="preserve">7. Descripcion Tecnica</w:t>
+        <w:t xml:space="preserve">7. Descripción Técnica</w:t>
       </w:r>
     </w:p>
     <w:p>
@@ -7206,7 +7206,7 @@
           <w:sz w:val="20"/>
           <w:szCs w:val="20"/>
         </w:rPr>
-        <w:t xml:space="preserve">El sistema IGA opera en una arquitectura en capas con MidPoint como nucleo orquestador:</w:t>
+        <w:t xml:space="preserve">El sistema IGA opera en una arquitectura en capas con MidPoint como núcleo orquestador:</w:t>
       </w:r>
     </w:p>
     <w:p>
@@ -7225,7 +7225,7 @@
           <w:sz w:val="20"/>
           <w:szCs w:val="20"/>
         </w:rPr>
-        <w:t xml:space="preserve">Capa de fuentes autoritativas (IIA): Oracle LAMB ERP — 4 schemas (MOISES/DAVID/ELISEO/JOSUE). Solo lectura. Fuente de verdad para datos de RR.HH. y academicos.</w:t>
+        <w:t xml:space="preserve">Capa de fuentes autoritativas (IIA): Oracle LAMB ERP — 4 schemas (MOISES/DAVID/ELISEO/JOSUE). Solo lectura. Fuente de verdad para datos de RR.HH. y académicos.</w:t>
       </w:r>
     </w:p>
     <w:p>
@@ -7263,7 +7263,7 @@
           <w:sz w:val="20"/>
           <w:szCs w:val="20"/>
         </w:rPr>
-        <w:t xml:space="preserve">Capa de directorio (OpenLDAP HA): dos nodos N-Way Multimaster (192.168.15.168 y .169). 34.551 identidades vivas con atributos eduPerson/SCHAC completos. Consumido por Keycloak via User Federation.</w:t>
+        <w:t xml:space="preserve">Capa de directorio (OpenLDAP HA): dos nodos N-Way Multimaster (192.168.15.168 y .169). 34.551 identidades vivas con atributos eduPerson/SCHAC completos. Consumido por Keycloak vía User Federation.</w:t>
       </w:r>
     </w:p>
     <w:p>
@@ -7282,7 +7282,7 @@
           <w:sz w:val="20"/>
           <w:szCs w:val="20"/>
         </w:rPr>
-        <w:t xml:space="preserve">Capa de SSO (Keycloak 26.6.1): actua como Identity Provider SAML/OIDC. Lee de OpenLDAP via User Federation. Provee SSO a sistemas internos y vendores academicos externos.</w:t>
+        <w:t xml:space="preserve">Capa de SSO (Keycloak 26.6.1): actúa como Identity Provider SAML/OIDC. Lee de OpenLDAP vía User Federation. Provee SSO a sistemas internos y vendores académicos externos.</w:t>
       </w:r>
     </w:p>
     <w:p>
@@ -7301,7 +7301,7 @@
           <w:sz w:val="20"/>
           <w:szCs w:val="20"/>
         </w:rPr>
-        <w:t xml:space="preserve">Capa de nube (Microsoft Entra ID): 37.305 identidades sincronizadas (lectura). Gobernara licencias M365 A1/A3/A5 en Fase 12.</w:t>
+        <w:t xml:space="preserve">Capa de nube (Microsoft Entra ID): 37.305 identidades sincronizadas (lectura). Gobernará licencias M365 A1/A3/A5 en Fase 12.</w:t>
       </w:r>
     </w:p>
     <w:p>
@@ -7320,7 +7320,7 @@
           <w:sz w:val="20"/>
           <w:szCs w:val="20"/>
         </w:rPr>
-        <w:t xml:space="preserve">Capa de aplicaciones (Koha ILS): 5.274 cuentas gestionadas via conector Java ConnId v1.2.1.</w:t>
+        <w:t xml:space="preserve">Capa de aplicaciones (Koha ILS): 5.274 cuentas gestionadas vía conector Java ConnId v1.2.1.</w:t>
       </w:r>
     </w:p>
     <w:p>
@@ -7341,7 +7341,7 @@
           <w:sz w:val="28"/>
           <w:szCs w:val="28"/>
         </w:rPr>
-        <w:t xml:space="preserve">7.2 Modelo de identidad canonico</w:t>
+        <w:t xml:space="preserve">7.2 Modelo de identidad canónico</w:t>
       </w:r>
     </w:p>
     <w:p>
@@ -7360,7 +7360,7 @@
           <w:sz w:val="20"/>
           <w:szCs w:val="20"/>
         </w:rPr>
-        <w:t xml:space="preserve">El modelo de identidad sigue los estandares ISO/IEC 24760, eduPerson 202208 y SCHAC 1.6.0, con 8 arquetipos de usuario y 8 de organizacion:</w:t>
+        <w:t xml:space="preserve">El modelo de identidad sigue los estándares ISO/IEC 24760, eduPerson 202208 y SCHAC 1.6.0, con 8 arquetipos de usuario y 8 de organización:</w:t>
       </w:r>
     </w:p>
     <w:tbl>
@@ -8250,7 +8250,7 @@
           <w:sz w:val="18"/>
           <w:szCs w:val="18"/>
         </w:rPr>
-        <w:t xml:space="preserve">* El archetype student refleja actualmente 1.679 usuarios correspondientes al ciclo Verano 2026. El resource Oracle LAMB Estudiantes esta configurado con el identificador de semestre fijo (ID_SEMESTRE = 279); la carga del padron del ciclo regular vigente — aproximadamente 23.620 estudiantes — requiere parametrizar dinamicamente el semestre y constituye una tarea pendiente priorizada del proyecto.</w:t>
+        <w:t xml:space="preserve">* El archetype student refleja actualmente 1.679 usuarios correspondientes al ciclo Verano 2026. El resource Oracle LAMB Estudiantes está configurado con el identificador de semestre fijo (ID_SEMESTRE = 279); la carga del padrón del ciclo regular vigente — aproximadamente 23.620 estudiantes — requiere parametrizar dinámicamente el semestre y constituye una tarea pendiente priorizada del proyecto.</w:t>
       </w:r>
     </w:p>
     <w:p>
@@ -8269,7 +8269,7 @@
           <w:sz w:val="18"/>
           <w:szCs w:val="18"/>
         </w:rPr>
-        <w:t xml:space="preserve">** Los archetypes employee-faculty (135) y employee-staff (3.144) reflejan la clasificacion actual del resource Trabajadores, que identifica como docente unicamente a quienes poseen categorizacion academica formal en ENOC.CAT_DOCENTE (estado 02). La planta docente real es de aproximadamente 1.190 docentes universitarios; los docentes sin categorizacion formal figuran provisionalmente bajo employee-staff. Ajustar el criterio de clasificacion docente/administrativo es una tarea pendiente del proyecto.</w:t>
+        <w:t xml:space="preserve">** Los archetypes employee-faculty (135) y employee-staff (3.144) reflejan la clasificación actual del resource Trabajadores, que identifica como docente únicamente a quienes poseen categorización académica formal en ENOC.CAT_DOCENTE (estado 02). La planta docente real es de aproximadamente 1.190 docentes universitarios; los docentes sin categorización formal figuran provisionalmente bajo employee-staff. Ajustar el criterio de clasificación docente/administrativo es una tarea pendiente del proyecto.</w:t>
       </w:r>
     </w:p>
     <w:p>
@@ -8590,7 +8590,7 @@
                 <w:sz w:val="18"/>
                 <w:szCs w:val="18"/>
               </w:rPr>
-              <w:t xml:space="preserve">JDBC directo. Correlacion por lambDocNum. Cron 02:00 UTC.</w:t>
+              <w:t xml:space="preserve">JDBC directo. Correlación por lambDocNum. Cron 02:00 UTC.</w:t>
             </w:r>
           </w:p>
         </w:tc>
@@ -8874,7 +8874,7 @@
                 <w:sz w:val="18"/>
                 <w:szCs w:val="18"/>
               </w:rPr>
-              <w:t xml:space="preserve">JDBC directo. Correlacion por taxId.</w:t>
+              <w:t xml:space="preserve">JDBC directo. Correlación por taxId.</w:t>
             </w:r>
           </w:p>
         </w:tc>
@@ -9504,7 +9504,7 @@
           <w:sz w:val="20"/>
           <w:szCs w:val="20"/>
         </w:rPr>
-        <w:t xml:space="preserve">MidPoint PROD se ejecuta en el servidor 192.168.15.166 (Ubuntu 22.04, Docker, 9.7 GB RAM). Toda la configuracion (resources, archetypes, roles, object templates, schemas) se versiona en el repositorio github.com/UPeU-Infra/midPointEcosystem con una estructura en dos capas:</w:t>
+        <w:t xml:space="preserve">MidPoint PROD se ejecuta en el servidor 192.168.15.166 (Ubuntu 22.04, Docker, 9.7 GB RAM). Toda la configuración (resources, archetypes, roles, object templates, schemas) se versiona en el repositorio github.com/UPeU-Infra/midPointEcosystem con una estructura en dos capas:</w:t>
       </w:r>
     </w:p>
     <w:p>
@@ -9523,7 +9523,7 @@
           <w:sz w:val="20"/>
           <w:szCs w:val="20"/>
         </w:rPr>
-        <w:t xml:space="preserve">canonical/: capa estandar agnostica a la institucion, basada en estandares internacionales (archetypes, schemas eduPerson/SCHAC, roles, object templates).</w:t>
+        <w:t xml:space="preserve">canonical/: capa estándar agnostica a la institucion, basada en estándares internacionales (archetypes, schemas eduPerson/SCHAC, roles, object templates).</w:t>
       </w:r>
     </w:p>
     <w:p>
@@ -9542,7 +9542,7 @@
           <w:sz w:val="20"/>
           <w:szCs w:val="20"/>
         </w:rPr>
-        <w:t xml:space="preserve">upeu/: overlay especifico UPeU (resources Oracle LAMB, orgs bootstrap, catálogos de sedes/facultades, roles MOF/GOV).</w:t>
+        <w:t xml:space="preserve">upeu/: overlay específico UPeU (resources Oracle LAMB, orgs bootstrap, catálogos de sedes/facultades, roles MOF/GOV).</w:t>
       </w:r>
     </w:p>
     <w:p>
@@ -9561,7 +9561,7 @@
           <w:sz w:val="20"/>
           <w:szCs w:val="20"/>
         </w:rPr>
-        <w:t xml:space="preserve">El flujo de cambios es siempre: modificar local -&gt; commit -&gt; push -&gt; git pull en servidor PROD -&gt; aplicar via REST API. Nunca se usa scp.</w:t>
+        <w:t xml:space="preserve">El flujo de cambios es siempre: modificar local -&gt; commit -&gt; push -&gt; git pull en servidor PROD -&gt; aplicar vía REST API. Nunca se usa scp.</w:t>
       </w:r>
     </w:p>
     <w:p>
@@ -9594,7 +9594,7 @@
           <w:sz w:val="28"/>
           <w:szCs w:val="28"/>
         </w:rPr>
-        <w:t xml:space="preserve">8.1 Metodologia</w:t>
+        <w:t xml:space="preserve">8.1 Metodología</w:t>
       </w:r>
     </w:p>
     <w:p>
@@ -9613,7 +9613,7 @@
           <w:sz w:val="20"/>
           <w:szCs w:val="20"/>
         </w:rPr>
-        <w:t xml:space="preserve">El proyecto sigue la metodologia "First Steps" de Evolveum para implementaciones MidPoint, adaptada al contexto universitario peruano. Se trabaja en sprints de dos semanas con entregas verificables en cada fase. La regla cardinal es: todo cambio se prueba en MidPoint DEV (192.168.15.230) antes de aplicar en PROD. El repositorio GitOps es la unica fuente de verdad de la configuracion.</w:t>
+        <w:t xml:space="preserve">El proyecto sigue la metodología "First Steps" de Evolveum para implementaciones MidPoint, adaptada al contexto universitario peruano. Se trabaja en sprints de dos semanas con entregas verificables en cada fase. La regla cardinal es: todo cambio se prueba en MidPoint DEV (192.168.15.230) antes de aplicar en PROD. El repositorio GitOps es la única fuente de verdad de la configuración.</w:t>
       </w:r>
     </w:p>
     <w:p>
@@ -9720,7 +9720,7 @@
                 <w:sz w:val="20"/>
                 <w:szCs w:val="20"/>
               </w:rPr>
-              <w:t xml:space="preserve">Descripcion</w:t>
+              <w:t xml:space="preserve">Descripción</w:t>
             </w:r>
           </w:p>
         </w:tc>
@@ -10214,7 +10214,7 @@
                 <w:sz w:val="18"/>
                 <w:szCs w:val="18"/>
               </w:rPr>
-              <w:t xml:space="preserve">Schema canonico v3.0 (eduPerson/SCHAC/SCIM)</w:t>
+              <w:t xml:space="preserve">Schema canónico v3.0 (eduPerson/SCHAC/SCIM)</w:t>
             </w:r>
           </w:p>
         </w:tc>
@@ -11943,7 +11943,7 @@
                 <w:sz w:val="18"/>
                 <w:szCs w:val="18"/>
               </w:rPr>
-              <w:t xml:space="preserve">Replanteo de documentacion interna</w:t>
+              <w:t xml:space="preserve">Replanteo de documentación interna</w:t>
             </w:r>
           </w:p>
         </w:tc>
@@ -12190,7 +12190,7 @@
                 <w:sz w:val="18"/>
                 <w:szCs w:val="18"/>
               </w:rPr>
-              <w:t xml:space="preserve">Validacion end-to-end con piloto real</w:t>
+              <w:t xml:space="preserve">Validación end-to-end con piloto real</w:t>
             </w:r>
           </w:p>
         </w:tc>
@@ -12437,7 +12437,7 @@
                 <w:sz w:val="18"/>
                 <w:szCs w:val="18"/>
               </w:rPr>
-              <w:t xml:space="preserve">Deploy PROD formal post-validacion</w:t>
+              <w:t xml:space="preserve">Deploy PROD formal post-validación</w:t>
             </w:r>
           </w:p>
         </w:tc>
@@ -12859,7 +12859,7 @@
                 <w:sz w:val="18"/>
                 <w:szCs w:val="18"/>
               </w:rPr>
-              <w:t xml:space="preserve">DIAGNOSTICO LISTO / BLOQUEADO</w:t>
+              <w:t xml:space="preserve">DIAGNÓSTICO LISTO / BLOQUEADO</w:t>
             </w:r>
           </w:p>
         </w:tc>
@@ -12931,7 +12931,7 @@
                 <w:sz w:val="18"/>
                 <w:szCs w:val="18"/>
               </w:rPr>
-              <w:t xml:space="preserve">Metricas COUNTER 5 bases academicas</w:t>
+              <w:t xml:space="preserve">Métricas COUNTER 5 bases académicas</w:t>
             </w:r>
           </w:p>
         </w:tc>
@@ -13324,7 +13324,7 @@
                 <w:sz w:val="18"/>
                 <w:szCs w:val="18"/>
               </w:rPr>
-              <w:t xml:space="preserve">Modelo canonico doctrinal publicado</w:t>
+              <w:t xml:space="preserve">Modelo canónico doctrinal publicado</w:t>
             </w:r>
           </w:p>
         </w:tc>
@@ -13680,7 +13680,7 @@
                 <w:sz w:val="18"/>
                 <w:szCs w:val="18"/>
               </w:rPr>
-              <w:t xml:space="preserve">7 resources activos; pipeline de reconciliacion</w:t>
+              <w:t xml:space="preserve">7 resources activos; pipeline de reconciliación</w:t>
             </w:r>
           </w:p>
         </w:tc>
@@ -13966,7 +13966,7 @@
                 <w:sz w:val="18"/>
                 <w:szCs w:val="18"/>
               </w:rPr>
-              <w:t xml:space="preserve">Validacion end-to-end con 3 usuarios piloto</w:t>
+              <w:t xml:space="preserve">Validación end-to-end con 3 usuarios piloto</w:t>
             </w:r>
           </w:p>
         </w:tc>
@@ -14180,7 +14180,7 @@
                 <w:sz w:val="18"/>
                 <w:szCs w:val="18"/>
               </w:rPr>
-              <w:t xml:space="preserve">Metricas COUNTER 5 operativas</w:t>
+              <w:t xml:space="preserve">Métricas COUNTER 5 operativas</w:t>
             </w:r>
           </w:p>
         </w:tc>
@@ -14392,7 +14392,7 @@
                 <w:sz w:val="20"/>
                 <w:szCs w:val="20"/>
               </w:rPr>
-              <w:t xml:space="preserve">Accion requerida</w:t>
+              <w:t xml:space="preserve">Acción requerida</w:t>
             </w:r>
           </w:p>
         </w:tc>
@@ -14748,7 +14748,7 @@
                 <w:sz w:val="18"/>
                 <w:szCs w:val="18"/>
               </w:rPr>
-              <w:t xml:space="preserve">Convenio RENIEC para validacion biometrica (IAL 3)</w:t>
+              <w:t xml:space="preserve">Convenio RENIEC para validación biométrica (IAL 3)</w:t>
             </w:r>
           </w:p>
         </w:tc>
@@ -14818,7 +14818,7 @@
                 <w:sz w:val="18"/>
                 <w:szCs w:val="18"/>
               </w:rPr>
-              <w:t xml:space="preserve">Area Juridica UPeU (no critico para piloto)</w:t>
+              <w:t xml:space="preserve">Área Jurídica UPeU (no crítico para piloto)</w:t>
             </w:r>
           </w:p>
         </w:tc>
@@ -15138,7 +15138,7 @@
                 <w:sz w:val="18"/>
                 <w:szCs w:val="18"/>
               </w:rPr>
-              <w:t xml:space="preserve">Aprobacion de recursos, representacion ante Rectoria, validacion de hitos estrategicos.</w:t>
+              <w:t xml:space="preserve">Aprobación de recursos, representación ante Rectoría, validación de hitos estratégicos.</w:t>
             </w:r>
           </w:p>
         </w:tc>
@@ -15280,7 +15280,7 @@
                 <w:sz w:val="18"/>
                 <w:szCs w:val="18"/>
               </w:rPr>
-              <w:t xml:space="preserve">Aprobacion de decisiones de arquitectura, gestion de permisos Entra ID (tenant UPeU), cuentas privilegiadas.</w:t>
+              <w:t xml:space="preserve">Aprobación de decisiones de arquitectura, gestión de permisos Entra ID (tenant UPeU), cuentas privilegiadas.</w:t>
             </w:r>
           </w:p>
         </w:tc>
@@ -15422,7 +15422,7 @@
                 <w:sz w:val="18"/>
                 <w:szCs w:val="18"/>
               </w:rPr>
-              <w:t xml:space="preserve">Aprovisionamiento de VMs, apertura de puertos de red, administracion de servidores Linux, soporte de acceso a Oracle LAMB.</w:t>
+              <w:t xml:space="preserve">Aprovisionamiento de VMs, apertura de puertos de red, administración de servidores Linux, soporte de acceso a Oracle LAMB.</w:t>
             </w:r>
           </w:p>
         </w:tc>
@@ -15564,7 +15564,7 @@
                 <w:sz w:val="18"/>
                 <w:szCs w:val="18"/>
               </w:rPr>
-              <w:t xml:space="preserve">Diseno e implementacion de toda la configuracion MidPoint, integraciones, RBAC, documentacion, GitOps, metricas COUNTER.</w:t>
+              <w:t xml:space="preserve">Diseño e implementación de toda la configuración MidPoint, integraciones, RBAC, documentación, GitOps, métricas COUNTER.</w:t>
             </w:r>
           </w:p>
         </w:tc>
@@ -15588,7 +15588,7 @@
           <w:sz w:val="28"/>
           <w:szCs w:val="28"/>
         </w:rPr>
-        <w:t xml:space="preserve">9.1 Modelo de coordinacion</w:t>
+        <w:t xml:space="preserve">9.1 Modelo de coordinación</w:t>
       </w:r>
     </w:p>
     <w:p>
@@ -15607,7 +15607,7 @@
           <w:sz w:val="20"/>
           <w:szCs w:val="20"/>
         </w:rPr>
-        <w:t xml:space="preserve">Las decisiones de arquitectura se documentan en docs/ARCHITECTURE.md y en el ROADMAP.md del repositorio. Los cambios a PROD requieren aprobacion explicita del gestor del proyecto. Las cuentas privilegiadas no son gestionadas por MidPoint — las gestiona David Urquizo directamente, con tickets formales en docs/runbooks/tickets-david-urquizo.md.</w:t>
+        <w:t xml:space="preserve">Las decisiones de arquitectura se documentan en docs/ARCHITECTURE.md y en el ROADMAP.md del repositorio. Los cambios a PROD requieren aprobación explicita del gestor del proyecto. Las cuentas privilegiadas no son gestionadas por MidPoint — las gestiona David Urquizo directamente, con tickets formales en docs/runbooks/tickets-david-urquizo.md.</w:t>
       </w:r>
     </w:p>
     <w:p>
@@ -15626,7 +15626,7 @@
           <w:sz w:val="20"/>
           <w:szCs w:val="20"/>
         </w:rPr>
-        <w:t xml:space="preserve">La reunion de revision de hitos se programa con el Director DTI al cierre de cada fase mayor (aprox. cada 4-6 semanas). Los bloqueantes que requieren accion de David Urquizo se escalan con al menos 5 dias habiles de anticipacion.</w:t>
+        <w:t xml:space="preserve">La reunión de revisión de hitos se programa con el Director DTI al cierre de cada fase mayor (aprox. cada 4-6 semanas). Los bloqueantes que requieren acción de David Urquizo se escalan con al menos 5 días hábiles de anticipación.</w:t>
       </w:r>
     </w:p>
     <w:p>
@@ -16139,7 +16139,7 @@
                 <w:sz w:val="18"/>
                 <w:szCs w:val="18"/>
               </w:rPr>
-              <w:t xml:space="preserve">Conector Java ConnId Koha (desarrollado DTI)</w:t>
+              <w:t xml:space="preserve">Conector Java ConnId Koha</w:t>
             </w:r>
           </w:p>
         </w:tc>
@@ -16203,13 +16203,13 @@
             <w:r>
               <w:rPr>
                 <w:rFonts w:ascii="Arial" w:cs="Arial" w:eastAsia="Arial" w:hAnsi="Arial"/>
-                <w:b w:val="false"/>
-                <w:bCs w:val="false"/>
-                <w:color w:val="111827"/>
-                <w:sz w:val="18"/>
-                <w:szCs w:val="18"/>
-              </w:rPr>
-              <w:t xml:space="preserve">S/ 0 (desarrollo interno)</w:t>
+                <w:b/>
+                <w:bCs/>
+                <w:color w:val="16A34A"/>
+                <w:sz w:val="18"/>
+                <w:szCs w:val="18"/>
+              </w:rPr>
+              <w:t xml:space="preserve">S/ 0</w:t>
             </w:r>
           </w:p>
         </w:tc>
@@ -17644,7 +17644,7 @@
                 <w:sz w:val="18"/>
                 <w:szCs w:val="18"/>
               </w:rPr>
-              <w:t xml:space="preserve">Fases 0-3: Fundacion (schema, archetypes, templates)</w:t>
+              <w:t xml:space="preserve">Fases 0-3: Fundación (schema, archetypes, templates)</w:t>
             </w:r>
           </w:p>
         </w:tc>
@@ -18638,7 +18638,7 @@
                 <w:sz w:val="18"/>
                 <w:szCs w:val="18"/>
               </w:rPr>
-              <w:t xml:space="preserve">Fase 13: Metricas COUNTER</w:t>
+              <w:t xml:space="preserve">Fase 13: Métricas COUNTER</w:t>
             </w:r>
           </w:p>
         </w:tc>
@@ -18885,7 +18885,7 @@
                 <w:sz w:val="18"/>
                 <w:szCs w:val="18"/>
               </w:rPr>
-              <w:t xml:space="preserve">Proyecto en ejecucion</w:t>
+              <w:t xml:space="preserve">Proyecto en ejecución</w:t>
             </w:r>
           </w:p>
         </w:tc>
@@ -18909,7 +18909,7 @@
           <w:sz w:val="28"/>
           <w:szCs w:val="28"/>
         </w:rPr>
-        <w:t xml:space="preserve">10.4 ROI: comparacion con alternativas comerciales</w:t>
+        <w:t xml:space="preserve">10.4 ROI: comparación con alternativas comerciales</w:t>
       </w:r>
     </w:p>
     <w:p>
@@ -18928,7 +18928,7 @@
           <w:sz w:val="20"/>
           <w:szCs w:val="20"/>
         </w:rPr>
-        <w:t xml:space="preserve">Una plataforma IGA comercial equivalente (SailPoint Identity Now, Saviynt o Oracle Identity Manager) tendria un costo anual de entre USD 50.000 y USD 300.000, mas un tiempo de implementacion de 6 a 18 meses con consultoria externa. La implementacion DTI de MidPoint ha alcanzado el mismo resultado en ~115 horas de trabajo interno (a la fecha), con costo adicional de S/ 0 en licencias, usando servidores ya existentes. El ahorro estimado vs alternativa comercial minima: &gt; USD 50.000/año.</w:t>
+        <w:t xml:space="preserve">Una plataforma IGA comercial equivalente (SailPoint Identity Now, Saviynt o Oracle Identity Manager) tendría un costo anual de entre USD 50.000 y USD 300.000, más un tiempo de implementación de 6 a 18 meses con consultoría externa. La implementación DTI de MidPoint ha alcanzado el mismo resultado en ~115 horas de trabajo interno (a la fecha), con costo adicional de S/ 0 en licencias, usando servidores ya existentes. El ahorro estimado vs alternativa comercial mínima: &gt; USD 50.000/año.</w:t>
       </w:r>
     </w:p>
     <w:p>
@@ -18945,7 +18945,7 @@
           <w:sz w:val="36"/>
           <w:szCs w:val="36"/>
         </w:rPr>
-        <w:t xml:space="preserve">11. Gestion de Riesgos</w:t>
+        <w:t xml:space="preserve">11. Gestión de Riesgos</w:t>
       </w:r>
     </w:p>
     <w:p>
@@ -19051,7 +19051,7 @@
                 <w:sz w:val="20"/>
                 <w:szCs w:val="20"/>
               </w:rPr>
-              <w:t xml:space="preserve">Descripcion del riesgo</w:t>
+              <w:t xml:space="preserve">Descripción del riesgo</w:t>
             </w:r>
           </w:p>
         </w:tc>
@@ -19263,7 +19263,7 @@
                 <w:sz w:val="18"/>
                 <w:szCs w:val="18"/>
               </w:rPr>
-              <w:t xml:space="preserve">OOM en servidor MidPoint PROD por insuficiencia de RAM bajo carga alta de reconciliacion</w:t>
+              <w:t xml:space="preserve">OOM en servidor MidPoint PROD por insuficiencia de RAM bajo carga alta de reconciliación</w:t>
             </w:r>
           </w:p>
         </w:tc>
@@ -19475,7 +19475,7 @@
                 <w:sz w:val="18"/>
                 <w:szCs w:val="18"/>
               </w:rPr>
-              <w:t xml:space="preserve">Cambio de estructura de vistas Oracle LAMB sin previo aviso (actualizacion ERP)</w:t>
+              <w:t xml:space="preserve">Cambio de estructura de vistas Oracle LAMB sin previo aviso (actualización ERP)</w:t>
             </w:r>
           </w:p>
         </w:tc>
@@ -19615,7 +19615,7 @@
                 <w:sz w:val="18"/>
                 <w:szCs w:val="18"/>
               </w:rPr>
-              <w:t xml:space="preserve">Resources MidPoint con correlacion por clave estable (cod_trabajador, DNI). Test de reconciliacion tras cada actualizacion LAMB.</w:t>
+              <w:t xml:space="preserve">Resources MidPoint con correlación por clave estable (cod_trabajador, DNI). Test de reconciliación tras cada actualización LAMB.</w:t>
             </w:r>
           </w:p>
         </w:tc>
@@ -19687,7 +19687,7 @@
                 <w:sz w:val="18"/>
                 <w:szCs w:val="18"/>
               </w:rPr>
-              <w:t xml:space="preserve">Demora en obtencion de permisos Entra ID (David Urquizo) bloquea Fase 12</w:t>
+              <w:t xml:space="preserve">Demora en obtención de permisos Entra ID (David Urquizo) bloquea Fase 12</w:t>
             </w:r>
           </w:p>
         </w:tc>
@@ -19827,7 +19827,7 @@
                 <w:sz w:val="18"/>
                 <w:szCs w:val="18"/>
               </w:rPr>
-              <w:t xml:space="preserve">Escalamiento formal con fecha limite. Fases 1-10 no requieren write Entra ID. Fase 12 tiene fecha floating.</w:t>
+              <w:t xml:space="preserve">Escalamiento formal con fecha límite. Fases 1-10 no requieren write Entra ID. Fase 12 tiene fecha floating.</w:t>
             </w:r>
           </w:p>
         </w:tc>
@@ -19899,7 +19899,7 @@
                 <w:sz w:val="18"/>
                 <w:szCs w:val="18"/>
               </w:rPr>
-              <w:t xml:space="preserve">Corrupcion del repositorio GitOps o perdida de configuracion</w:t>
+              <w:t xml:space="preserve">Corrupcion del repositorio GitOps o perdida de configuración</w:t>
             </w:r>
           </w:p>
         </w:tc>
@@ -19969,7 +19969,7 @@
                 <w:sz w:val="18"/>
                 <w:szCs w:val="18"/>
               </w:rPr>
-              <w:t xml:space="preserve">Critico</w:t>
+              <w:t xml:space="preserve">Crítico</w:t>
             </w:r>
           </w:p>
         </w:tc>
@@ -20039,7 +20039,7 @@
                 <w:sz w:val="18"/>
                 <w:szCs w:val="18"/>
               </w:rPr>
-              <w:t xml:space="preserve">Repositorio GitHub con historial completo. Tags de version por hito. Backup PostgreSQL semanal del servidor PROD.</w:t>
+              <w:t xml:space="preserve">Repositorio GitHub con historial completo. Tags de versión por hito. Backup PostgreSQL semanal del servidor PROD.</w:t>
             </w:r>
           </w:p>
         </w:tc>
@@ -20251,7 +20251,7 @@
                 <w:sz w:val="18"/>
                 <w:szCs w:val="18"/>
               </w:rPr>
-              <w:t xml:space="preserve">Documentacion clara en runbooks. Capacitacion presencial de 2h para el equipo DTI. Flujo CLI simple documentado.</w:t>
+              <w:t xml:space="preserve">Documentación clara en runbooks. Capacitacion presencial de 2h para el equipo DTI. Flujo CLI simple documentado.</w:t>
             </w:r>
           </w:p>
         </w:tc>
@@ -20323,7 +20323,7 @@
                 <w:sz w:val="18"/>
                 <w:szCs w:val="18"/>
               </w:rPr>
-              <w:t xml:space="preserve">Incidente de seguridad por exposicion de credenciales Oracle LAMB</w:t>
+              <w:t xml:space="preserve">Incidente de seguridad por exposición de credenciales Oracle LAMB</w:t>
             </w:r>
           </w:p>
         </w:tc>
@@ -20393,7 +20393,7 @@
                 <w:sz w:val="18"/>
                 <w:szCs w:val="18"/>
               </w:rPr>
-              <w:t xml:space="preserve">Critico</w:t>
+              <w:t xml:space="preserve">Crítico</w:t>
             </w:r>
           </w:p>
         </w:tc>
@@ -20535,7 +20535,7 @@
                 <w:sz w:val="18"/>
                 <w:szCs w:val="18"/>
               </w:rPr>
-              <w:t xml:space="preserve">Fallo de la federacion Keycloak -&gt; OpenLDAP genera indisponibilidad de SSO</w:t>
+              <w:t xml:space="preserve">Fallo de la federación Keycloak -&gt; OpenLDAP genera indisponibilidad de SSO</w:t>
             </w:r>
           </w:p>
         </w:tc>
@@ -20675,7 +20675,7 @@
                 <w:sz w:val="18"/>
                 <w:szCs w:val="18"/>
               </w:rPr>
-              <w:t xml:space="preserve">OpenLDAP HA con dos nodos. Keycloak configurado con failover a nodo 2. Runbook de recuperacion documentado.</w:t>
+              <w:t xml:space="preserve">OpenLDAP HA con dos nodos. Keycloak configurado con failover a nodo 2. Runbook de recuperación documentado.</w:t>
             </w:r>
           </w:p>
         </w:tc>
@@ -20719,7 +20719,7 @@
           <w:sz w:val="36"/>
           <w:szCs w:val="36"/>
         </w:rPr>
-        <w:t xml:space="preserve">12. Indicadores de Exito (KPIs)</w:t>
+        <w:t xml:space="preserve">12. Indicadores de Éxito (KPIs)</w:t>
       </w:r>
     </w:p>
     <w:tbl>
@@ -21091,7 +21091,7 @@
                 <w:sz w:val="18"/>
                 <w:szCs w:val="18"/>
               </w:rPr>
-              <w:t xml:space="preserve">&lt; 24 horas (automatico)</w:t>
+              <w:t xml:space="preserve">&lt; 24 horas (automático)</w:t>
             </w:r>
           </w:p>
         </w:tc>
@@ -21198,7 +21198,7 @@
                 <w:sz w:val="18"/>
                 <w:szCs w:val="18"/>
               </w:rPr>
-              <w:t xml:space="preserve">Cobertura de reconciliacion diaria LAMB</w:t>
+              <w:t xml:space="preserve">Cobertura de reconciliación diaria LAMB</w:t>
             </w:r>
           </w:p>
         </w:tc>
@@ -21482,7 +21482,7 @@
                 <w:sz w:val="18"/>
                 <w:szCs w:val="18"/>
               </w:rPr>
-              <w:t xml:space="preserve">Cuentas Koha gestionadas automaticamente</w:t>
+              <w:t xml:space="preserve">Cuentas Koha gestionadas automáticamente</w:t>
             </w:r>
           </w:p>
         </w:tc>
@@ -22476,7 +22476,7 @@
                 <w:sz w:val="18"/>
                 <w:szCs w:val="18"/>
               </w:rPr>
-              <w:t xml:space="preserve">Cuentas huerfanas post-cese detectadas</w:t>
+              <w:t xml:space="preserve">Cuentas huérfanas post-cese detectadas</w:t>
             </w:r>
           </w:p>
         </w:tc>
@@ -22511,7 +22511,7 @@
                 <w:sz w:val="18"/>
                 <w:szCs w:val="18"/>
               </w:rPr>
-              <w:t xml:space="preserve">0 en sistemas criticos</w:t>
+              <w:t xml:space="preserve">0 en sistemas críticos</w:t>
             </w:r>
           </w:p>
         </w:tc>
@@ -22546,7 +22546,7 @@
                 <w:sz w:val="18"/>
                 <w:szCs w:val="18"/>
               </w:rPr>
-              <w:t xml:space="preserve">En validacion (Fase 9)</w:t>
+              <w:t xml:space="preserve">En validación (Fase 9)</w:t>
             </w:r>
           </w:p>
         </w:tc>
@@ -22688,7 +22688,7 @@
                 <w:sz w:val="18"/>
                 <w:szCs w:val="18"/>
               </w:rPr>
-              <w:t xml:space="preserve">Automatico (Validity Scanner 15 min)</w:t>
+              <w:t xml:space="preserve">Automático (Validity Scanner 15 min)</w:t>
             </w:r>
           </w:p>
         </w:tc>
@@ -22760,7 +22760,7 @@
                 <w:sz w:val="18"/>
                 <w:szCs w:val="18"/>
               </w:rPr>
-              <w:t xml:space="preserve">Evidencia exportable para auditoria SUNEDU</w:t>
+              <w:t xml:space="preserve">Evidencia exportable para auditoría SUNEDU</w:t>
             </w:r>
           </w:p>
         </w:tc>
@@ -22795,7 +22795,7 @@
                 <w:sz w:val="18"/>
                 <w:szCs w:val="18"/>
               </w:rPr>
-              <w:t xml:space="preserve">Si — disponible en MidPoint</w:t>
+              <w:t xml:space="preserve">Sí — disponible en MidPoint</w:t>
             </w:r>
           </w:p>
         </w:tc>
@@ -22920,7 +22920,7 @@
           <w:sz w:val="20"/>
           <w:szCs w:val="20"/>
         </w:rPr>
-        <w:t xml:space="preserve">El proyecto DTI-IGA-2026-001 ha alcanzado resultados sustanciales en su primera mitad de ejecucion (fases 0-6 completadas, fase 7 parcial):</w:t>
+        <w:t xml:space="preserve">El proyecto DTI-IGA-2026-001 ha alcanzado resultados sustanciales en su primera mitad de ejecución (fases 0-6 completadas, fase 7 parcial):</w:t>
       </w:r>
     </w:p>
     <w:p>
@@ -22939,7 +22939,7 @@
           <w:sz w:val="20"/>
           <w:szCs w:val="20"/>
         </w:rPr>
-        <w:t xml:space="preserve">35.970 identidades unificadas en MidPoint con modelo canonico eduPerson/SCHAC/SCIM, sin costo adicional de licencias.</w:t>
+        <w:t xml:space="preserve">35.970 identidades unificadas en MidPoint con modelo canónico eduPerson/SCHAC/SCIM, sin costo adicional de licencias.</w:t>
       </w:r>
     </w:p>
     <w:p>
@@ -22977,7 +22977,7 @@
           <w:sz w:val="20"/>
           <w:szCs w:val="20"/>
         </w:rPr>
-        <w:t xml:space="preserve">34.551 cuentas vivas sincronizadas en el directorio OpenLDAP con atributos federados, habilitando SSO via Keycloak hacia sistemas internos.</w:t>
+        <w:t xml:space="preserve">34.551 cuentas vivas sincronizadas en el directorio OpenLDAP con atributos federados, habilitando SSO vía Keycloak hacia sistemas internos.</w:t>
       </w:r>
     </w:p>
     <w:p>
@@ -22996,7 +22996,7 @@
           <w:sz w:val="20"/>
           <w:szCs w:val="20"/>
         </w:rPr>
-        <w:t xml:space="preserve">Pipeline de reconciliacion automatico operativo: Trigger Scanner (5 min), Validity Scanner (15 min), 3 crons LAMB diarios, Koha cron diario.</w:t>
+        <w:t xml:space="preserve">Pipeline de reconciliación automático operativo: Trigger Scanner (5 min), Validity Scanner (15 min), 3 crons LAMB diarios, Koha cron diario.</w:t>
       </w:r>
     </w:p>
     <w:p>
@@ -23034,7 +23034,7 @@
           <w:sz w:val="20"/>
           <w:szCs w:val="20"/>
         </w:rPr>
-        <w:t xml:space="preserve">Arquitectura en dos capas (modelo canonico estandar + overlay UPeU) que mantiene la configuracion ordenada, versionada y alineada con estandares internacionales (eduPerson, SCHAC, ISO 24760).</w:t>
+        <w:t xml:space="preserve">Arquitectura en dos capas (modelo canónico estándar + overlay UPeU) que mantiene la configuración ordenada, versionada y alineada con estándares internacionales (eduPerson, SCHAC, ISO 24760).</w:t>
       </w:r>
     </w:p>
     <w:p>
@@ -23055,7 +23055,7 @@
           <w:sz w:val="28"/>
           <w:szCs w:val="28"/>
         </w:rPr>
-        <w:t xml:space="preserve">13.2 Proximos pasos criticos</w:t>
+        <w:t xml:space="preserve">13.2 Próximos pasos críticos</w:t>
       </w:r>
     </w:p>
     <w:p>
@@ -23074,7 +23074,7 @@
           <w:sz w:val="20"/>
           <w:szCs w:val="20"/>
         </w:rPr>
-        <w:t xml:space="preserve">Carga del padron estudiantil completo: parametrizar dinamicamente el semestre en el resource Oracle LAMB Estudiantes (hoy fijado al ciclo Verano 2026, ID_SEMESTRE = 279) para incorporar los aproximadamente 23.620 estudiantes del ciclo regular vigente.</w:t>
+        <w:t xml:space="preserve">Carga del padrón estudiantil completo: parametrizar dinámicamente el semestre en el resource Oracle LAMB Estudiantes (hoy fijado al ciclo Verano 2026, ID_SEMESTRE = 279) para incorporar los aproximadamente 23.620 estudiantes del ciclo regular vigente.</w:t>
       </w:r>
     </w:p>
     <w:p>
@@ -23093,7 +23093,7 @@
           <w:sz w:val="20"/>
           <w:szCs w:val="20"/>
         </w:rPr>
-        <w:t xml:space="preserve">Correccion del criterio docente/administrativo: ajustar el resource Trabajadores para clasificar como employee-faculty a los aproximadamente 1.190 docentes universitarios reales, no solo a los 135 con categorizacion academica formal en ENOC.CAT_DOCENTE.</w:t>
+        <w:t xml:space="preserve">Corrección del criterio docente/administrativo: ajustar el resource Trabajadores para clasificar como employee-faculty a los aproximadamente 1.190 docentes universitarios reales, no solo a los 135 con categorización académica formal en ENOC.CAT_DOCENTE.</w:t>
       </w:r>
     </w:p>
     <w:p>
@@ -23131,7 +23131,7 @@
           <w:sz w:val="20"/>
           <w:szCs w:val="20"/>
         </w:rPr>
-        <w:t xml:space="preserve">Validacion end-to-end (Fase 9): ejecutar el flujo completo joiner-mover-leaver con 3 usuarios piloto reales y documentar evidencia para SUNEDU/SINEACE.</w:t>
+        <w:t xml:space="preserve">Validación end-to-end (Fase 9): ejecutar el flujo completo joiner-mover-leaver con 3 usuarios piloto reales y documentar evidencia para SUNEDU/SINEACE.</w:t>
       </w:r>
     </w:p>
     <w:p>
@@ -23169,7 +23169,7 @@
           <w:sz w:val="20"/>
           <w:szCs w:val="20"/>
         </w:rPr>
-        <w:t xml:space="preserve">Metricas COUNTER (Fase 13): configurar harvest SUSHI de Scopus, EBSCO, WoS, IEEE para producir reportes de uso por facultad y programa para negociacion de renovacion de suscripciones.</w:t>
+        <w:t xml:space="preserve">Métricas COUNTER (Fase 13): configurar harvest SUSHI de Scopus, EBSCO, WoS, IEEE para producir reportes de uso por facultad y programa para negociación de renovación de suscripciones.</w:t>
       </w:r>
     </w:p>
     <w:p>
@@ -23190,7 +23190,7 @@
           <w:sz w:val="28"/>
           <w:szCs w:val="28"/>
         </w:rPr>
-        <w:t xml:space="preserve">13.3 Solicitud de aprobacion</w:t>
+        <w:t xml:space="preserve">13.3 Solicitud de aprobación</w:t>
       </w:r>
     </w:p>
     <w:p>
@@ -23209,7 +23209,7 @@
           <w:sz w:val="20"/>
           <w:szCs w:val="20"/>
         </w:rPr>
-        <w:t xml:space="preserve">Se solicita al Director DTI David Barrantes la aprobacion formal de este documento de proyecto, que habilita:</w:t>
+        <w:t xml:space="preserve">Se solicita al Director DTI David Barrantes la aprobación formal de este documento de proyecto, que habilita:</w:t>
       </w:r>
     </w:p>
     <w:p>
@@ -23228,7 +23228,7 @@
           <w:sz w:val="20"/>
           <w:szCs w:val="20"/>
         </w:rPr>
-        <w:t xml:space="preserve">La continuacion de las fases pendientes (7, 8, 9, 12, 13) dentro del calendario establecido.</w:t>
+        <w:t xml:space="preserve">La continuación de las fases pendientes (7, 8, 9, 12, 13) dentro del calendario establecido.</w:t>
       </w:r>
     </w:p>
     <w:p>
@@ -23247,7 +23247,7 @@
           <w:sz w:val="20"/>
           <w:szCs w:val="20"/>
         </w:rPr>
-        <w:t xml:space="preserve">La gestion formal de los bloqueantes activos: solicitar a David Urquizo los 4 permisos Entra ID faltantes para desbloquer Fase 12.</w:t>
+        <w:t xml:space="preserve">La gestión formal de los bloqueantes activos: solicitar a David Urquizo los 4 permisos Entra ID faltantes para desbloquer Fase 12.</w:t>
       </w:r>
     </w:p>
     <w:p>
@@ -23266,7 +23266,7 @@
           <w:sz w:val="20"/>
           <w:szCs w:val="20"/>
         </w:rPr>
-        <w:t xml:space="preserve">La asignacion formal del equipo del proyecto (David Barrantes, David Urquizo, Rudy Milan, Alberto Sanchez) con los roles y responsabilidades descritos en la Seccion 9.</w:t>
+        <w:t xml:space="preserve">La asignación formal del equipo del proyecto (David Barrantes, David Urquizo, Rudy Milan, Alberto Sanchez) con los roles y responsabilidades descritos en la Sección 9.</w:t>
       </w:r>
     </w:p>
     <w:p>
@@ -23424,7 +23424,7 @@
                 <w:sz w:val="18"/>
                 <w:szCs w:val="18"/>
               </w:rPr>
-              <w:t xml:space="preserve">Director de Tecnologias de Informacion</w:t>
+              <w:t xml:space="preserve">Director de Tecnologías de Información</w:t>
             </w:r>
           </w:p>
           <w:p>
@@ -23438,7 +23438,7 @@
                 <w:sz w:val="18"/>
                 <w:szCs w:val="18"/>
               </w:rPr>
-              <w:t xml:space="preserve">Firma: _________________________ Fecha: ___________</w:t>
+              <w:t xml:space="preserve">Firma: _________________________ Fecha: _________________________</w:t>
             </w:r>
           </w:p>
         </w:tc>
@@ -23525,7 +23525,7 @@
           <w:sz w:val="16"/>
           <w:szCs w:val="16"/>
         </w:rPr>
-        <w:t xml:space="preserve">Documento generado por la Direccion de Tecnologias de Informacion — Universidad Peruana Union. Para consultas: alberto.sanchez@upeu.edu.pe</w:t>
+        <w:t xml:space="preserve">Documento generado por la Dirección de Tecnologías de Información — Universidad Peruana Unión. Para consultas: jsanchez@upeu.edu.pe</w:t>
       </w:r>
     </w:p>
     <w:sectPr>
@@ -23597,7 +23597,7 @@
         <w:sz w:val="16"/>
         <w:szCs w:val="16"/>
       </w:rPr>
-      <w:t xml:space="preserve">Universidad Peruana Union — Direccion de Tecnologias de Informacion | Pagina </w:t>
+      <w:t xml:space="preserve">Universidad Peruana Unión — Dirección de Tecnologías de Información | Página </w:t>
     </w:r>
     <w:r>
       <w:rPr>

</xml_diff>

<commit_message>
docs: versionar a 1.2 — reorientación de objetivos específicos
</commit_message>
<xml_diff>
--- a/docs/DTI-IGA-2026-001-Proyecto.docx
+++ b/docs/DTI-IGA-2026-001-Proyecto.docx
@@ -562,7 +562,7 @@
                 <w:sz w:val="18"/>
                 <w:szCs w:val="18"/>
               </w:rPr>
-              <w:t>Versión: 1.1 | Fecha: 21 de mayo de 2026</w:t>
+              <w:t>Versión: 1.2 | Fecha: 21 de mayo de 2026</w:t>
             </w:r>
           </w:p>
         </w:tc>
@@ -4449,7 +4449,7 @@
           </w:tcPr>
           <w:p>
             <w:r>
-              <w:t>1.1 — 21 de mayo de 2026 (cifras verificadas contra Oracle LAMB y MidPoint PROD)</w:t>
+              <w:t>1.2 — 21 de mayo de 2026 (objetivos específicos reorientados a capacidades de gobernanza)</w:t>
             </w:r>
           </w:p>
         </w:tc>

</xml_diff>

<commit_message>
docs: agregar tabla de historial de versiones al documento de proyecto
</commit_message>
<xml_diff>
--- a/docs/DTI-IGA-2026-001-Proyecto.docx
+++ b/docs/DTI-IGA-2026-001-Proyecto.docx
@@ -596,6 +596,430 @@
         </w:tc>
       </w:tr>
     </w:tbl>
+    <w:p>
+      <w:pPr>
+        <w:jc w:val="left"/>
+      </w:pPr>
+      <w:r>
+        <w:rPr>
+          <w:b/>
+          <w:sz w:val="18"/>
+        </w:rPr>
+        <w:t>Historial de versiones</w:t>
+      </w:r>
+    </w:p>
+    <w:tbl>
+      <w:tblPr>
+        <w:tblW w:type="auto" w:w="0"/>
+        <w:tblLook w:firstColumn="1" w:firstRow="1" w:lastColumn="0" w:lastRow="0" w:noHBand="0" w:noVBand="1" w:val="04A0"/>
+      </w:tblPr>
+      <w:tblGrid>
+        <w:gridCol w:w="2346"/>
+        <w:gridCol w:w="2346"/>
+        <w:gridCol w:w="2346"/>
+        <w:gridCol w:w="2346"/>
+      </w:tblGrid>
+      <w:tr>
+        <w:tc>
+          <w:tcPr>
+            <w:tcW w:type="dxa" w:w="1008"/>
+            <w:shd w:val="clear" w:color="auto" w:fill="1F3864"/>
+            <w:tcBorders>
+              <w:top w:val="single" w:sz="4" w:color="AAAAAA"/>
+              <w:left w:val="single" w:sz="4" w:color="AAAAAA"/>
+              <w:bottom w:val="single" w:sz="4" w:color="AAAAAA"/>
+              <w:right w:val="single" w:sz="4" w:color="AAAAAA"/>
+            </w:tcBorders>
+          </w:tcPr>
+          <w:p>
+            <w:pPr>
+              <w:jc w:val="left"/>
+            </w:pPr>
+            <w:r/>
+            <w:r>
+              <w:rPr>
+                <w:b/>
+                <w:color w:val="FFFFFF"/>
+                <w:sz w:val="18"/>
+              </w:rPr>
+              <w:t>Versión</w:t>
+            </w:r>
+          </w:p>
+        </w:tc>
+        <w:tc>
+          <w:tcPr>
+            <w:tcW w:type="dxa" w:w="2016"/>
+            <w:shd w:val="clear" w:color="auto" w:fill="1F3864"/>
+            <w:tcBorders>
+              <w:top w:val="single" w:sz="4" w:color="AAAAAA"/>
+              <w:left w:val="single" w:sz="4" w:color="AAAAAA"/>
+              <w:bottom w:val="single" w:sz="4" w:color="AAAAAA"/>
+              <w:right w:val="single" w:sz="4" w:color="AAAAAA"/>
+            </w:tcBorders>
+          </w:tcPr>
+          <w:p>
+            <w:pPr>
+              <w:jc w:val="left"/>
+            </w:pPr>
+            <w:r/>
+            <w:r>
+              <w:rPr>
+                <w:b/>
+                <w:color w:val="FFFFFF"/>
+                <w:sz w:val="18"/>
+              </w:rPr>
+              <w:t>Fecha</w:t>
+            </w:r>
+          </w:p>
+        </w:tc>
+        <w:tc>
+          <w:tcPr>
+            <w:tcW w:type="dxa" w:w="5040"/>
+            <w:shd w:val="clear" w:color="auto" w:fill="1F3864"/>
+            <w:tcBorders>
+              <w:top w:val="single" w:sz="4" w:color="AAAAAA"/>
+              <w:left w:val="single" w:sz="4" w:color="AAAAAA"/>
+              <w:bottom w:val="single" w:sz="4" w:color="AAAAAA"/>
+              <w:right w:val="single" w:sz="4" w:color="AAAAAA"/>
+            </w:tcBorders>
+          </w:tcPr>
+          <w:p>
+            <w:pPr>
+              <w:jc w:val="left"/>
+            </w:pPr>
+            <w:r/>
+            <w:r>
+              <w:rPr>
+                <w:b/>
+                <w:color w:val="FFFFFF"/>
+                <w:sz w:val="18"/>
+              </w:rPr>
+              <w:t>Descripción del cambio</w:t>
+            </w:r>
+          </w:p>
+        </w:tc>
+        <w:tc>
+          <w:tcPr>
+            <w:tcW w:type="dxa" w:w="2016"/>
+            <w:shd w:val="clear" w:color="auto" w:fill="1F3864"/>
+            <w:tcBorders>
+              <w:top w:val="single" w:sz="4" w:color="AAAAAA"/>
+              <w:left w:val="single" w:sz="4" w:color="AAAAAA"/>
+              <w:bottom w:val="single" w:sz="4" w:color="AAAAAA"/>
+              <w:right w:val="single" w:sz="4" w:color="AAAAAA"/>
+            </w:tcBorders>
+          </w:tcPr>
+          <w:p>
+            <w:pPr>
+              <w:jc w:val="left"/>
+            </w:pPr>
+            <w:r/>
+            <w:r>
+              <w:rPr>
+                <w:b/>
+                <w:color w:val="FFFFFF"/>
+                <w:sz w:val="18"/>
+              </w:rPr>
+              <w:t>Autor(es)</w:t>
+            </w:r>
+          </w:p>
+        </w:tc>
+      </w:tr>
+      <w:tr>
+        <w:tc>
+          <w:tcPr>
+            <w:tcW w:type="dxa" w:w="1008"/>
+            <w:tcBorders>
+              <w:top w:val="single" w:sz="4" w:color="AAAAAA"/>
+              <w:left w:val="single" w:sz="4" w:color="AAAAAA"/>
+              <w:bottom w:val="single" w:sz="4" w:color="AAAAAA"/>
+              <w:right w:val="single" w:sz="4" w:color="AAAAAA"/>
+            </w:tcBorders>
+          </w:tcPr>
+          <w:p>
+            <w:pPr>
+              <w:jc w:val="left"/>
+            </w:pPr>
+            <w:r/>
+            <w:r>
+              <w:rPr>
+                <w:sz w:val="18"/>
+              </w:rPr>
+              <w:t>1.0</w:t>
+            </w:r>
+          </w:p>
+        </w:tc>
+        <w:tc>
+          <w:tcPr>
+            <w:tcW w:type="dxa" w:w="2016"/>
+            <w:tcBorders>
+              <w:top w:val="single" w:sz="4" w:color="AAAAAA"/>
+              <w:left w:val="single" w:sz="4" w:color="AAAAAA"/>
+              <w:bottom w:val="single" w:sz="4" w:color="AAAAAA"/>
+              <w:right w:val="single" w:sz="4" w:color="AAAAAA"/>
+            </w:tcBorders>
+          </w:tcPr>
+          <w:p>
+            <w:pPr>
+              <w:jc w:val="left"/>
+            </w:pPr>
+            <w:r/>
+            <w:r>
+              <w:rPr>
+                <w:sz w:val="18"/>
+              </w:rPr>
+              <w:t>Mayo 2026</w:t>
+            </w:r>
+          </w:p>
+        </w:tc>
+        <w:tc>
+          <w:tcPr>
+            <w:tcW w:type="dxa" w:w="5040"/>
+            <w:tcBorders>
+              <w:top w:val="single" w:sz="4" w:color="AAAAAA"/>
+              <w:left w:val="single" w:sz="4" w:color="AAAAAA"/>
+              <w:bottom w:val="single" w:sz="4" w:color="AAAAAA"/>
+              <w:right w:val="single" w:sz="4" w:color="AAAAAA"/>
+            </w:tcBorders>
+          </w:tcPr>
+          <w:p>
+            <w:pPr>
+              <w:jc w:val="left"/>
+            </w:pPr>
+            <w:r/>
+            <w:r>
+              <w:rPr>
+                <w:sz w:val="18"/>
+              </w:rPr>
+              <w:t>Versión inicial del documento de proyecto IGA.</w:t>
+            </w:r>
+          </w:p>
+        </w:tc>
+        <w:tc>
+          <w:tcPr>
+            <w:tcW w:type="dxa" w:w="2016"/>
+            <w:tcBorders>
+              <w:top w:val="single" w:sz="4" w:color="AAAAAA"/>
+              <w:left w:val="single" w:sz="4" w:color="AAAAAA"/>
+              <w:bottom w:val="single" w:sz="4" w:color="AAAAAA"/>
+              <w:right w:val="single" w:sz="4" w:color="AAAAAA"/>
+            </w:tcBorders>
+          </w:tcPr>
+          <w:p>
+            <w:pPr>
+              <w:jc w:val="left"/>
+            </w:pPr>
+            <w:r/>
+            <w:r>
+              <w:rPr>
+                <w:sz w:val="18"/>
+              </w:rPr>
+              <w:t>Alberto Sanchez</w:t>
+            </w:r>
+          </w:p>
+        </w:tc>
+      </w:tr>
+      <w:tr>
+        <w:tc>
+          <w:tcPr>
+            <w:tcW w:type="dxa" w:w="1008"/>
+            <w:shd w:val="clear" w:color="auto" w:fill="EEF2F7"/>
+            <w:tcBorders>
+              <w:top w:val="single" w:sz="4" w:color="AAAAAA"/>
+              <w:left w:val="single" w:sz="4" w:color="AAAAAA"/>
+              <w:bottom w:val="single" w:sz="4" w:color="AAAAAA"/>
+              <w:right w:val="single" w:sz="4" w:color="AAAAAA"/>
+            </w:tcBorders>
+          </w:tcPr>
+          <w:p>
+            <w:pPr>
+              <w:jc w:val="left"/>
+            </w:pPr>
+            <w:r/>
+            <w:r>
+              <w:rPr>
+                <w:sz w:val="18"/>
+              </w:rPr>
+              <w:t>1.1</w:t>
+            </w:r>
+          </w:p>
+        </w:tc>
+        <w:tc>
+          <w:tcPr>
+            <w:tcW w:type="dxa" w:w="2016"/>
+            <w:shd w:val="clear" w:color="auto" w:fill="EEF2F7"/>
+            <w:tcBorders>
+              <w:top w:val="single" w:sz="4" w:color="AAAAAA"/>
+              <w:left w:val="single" w:sz="4" w:color="AAAAAA"/>
+              <w:bottom w:val="single" w:sz="4" w:color="AAAAAA"/>
+              <w:right w:val="single" w:sz="4" w:color="AAAAAA"/>
+            </w:tcBorders>
+          </w:tcPr>
+          <w:p>
+            <w:pPr>
+              <w:jc w:val="left"/>
+            </w:pPr>
+            <w:r/>
+            <w:r>
+              <w:rPr>
+                <w:sz w:val="18"/>
+              </w:rPr>
+              <w:t>21 de mayo de 2026</w:t>
+            </w:r>
+          </w:p>
+        </w:tc>
+        <w:tc>
+          <w:tcPr>
+            <w:tcW w:type="dxa" w:w="5040"/>
+            <w:shd w:val="clear" w:color="auto" w:fill="EEF2F7"/>
+            <w:tcBorders>
+              <w:top w:val="single" w:sz="4" w:color="AAAAAA"/>
+              <w:left w:val="single" w:sz="4" w:color="AAAAAA"/>
+              <w:bottom w:val="single" w:sz="4" w:color="AAAAAA"/>
+              <w:right w:val="single" w:sz="4" w:color="AAAAAA"/>
+            </w:tcBorders>
+          </w:tcPr>
+          <w:p>
+            <w:pPr>
+              <w:jc w:val="left"/>
+            </w:pPr>
+            <w:r/>
+            <w:r>
+              <w:rPr>
+                <w:sz w:val="18"/>
+              </w:rPr>
+              <w:t>Verificación de cifras y estado actual contra Oracle LAMB y MidPoint PROD.</w:t>
+            </w:r>
+          </w:p>
+        </w:tc>
+        <w:tc>
+          <w:tcPr>
+            <w:tcW w:type="dxa" w:w="2016"/>
+            <w:shd w:val="clear" w:color="auto" w:fill="EEF2F7"/>
+            <w:tcBorders>
+              <w:top w:val="single" w:sz="4" w:color="AAAAAA"/>
+              <w:left w:val="single" w:sz="4" w:color="AAAAAA"/>
+              <w:bottom w:val="single" w:sz="4" w:color="AAAAAA"/>
+              <w:right w:val="single" w:sz="4" w:color="AAAAAA"/>
+            </w:tcBorders>
+          </w:tcPr>
+          <w:p>
+            <w:pPr>
+              <w:jc w:val="left"/>
+            </w:pPr>
+            <w:r/>
+            <w:r>
+              <w:rPr>
+                <w:sz w:val="18"/>
+              </w:rPr>
+              <w:t>Alberto Sanchez</w:t>
+            </w:r>
+          </w:p>
+        </w:tc>
+      </w:tr>
+      <w:tr>
+        <w:tc>
+          <w:tcPr>
+            <w:tcW w:type="dxa" w:w="1008"/>
+            <w:tcBorders>
+              <w:top w:val="single" w:sz="4" w:color="AAAAAA"/>
+              <w:left w:val="single" w:sz="4" w:color="AAAAAA"/>
+              <w:bottom w:val="single" w:sz="4" w:color="AAAAAA"/>
+              <w:right w:val="single" w:sz="4" w:color="AAAAAA"/>
+            </w:tcBorders>
+          </w:tcPr>
+          <w:p>
+            <w:pPr>
+              <w:jc w:val="left"/>
+            </w:pPr>
+            <w:r/>
+            <w:r>
+              <w:rPr>
+                <w:sz w:val="18"/>
+              </w:rPr>
+              <w:t>1.2</w:t>
+            </w:r>
+          </w:p>
+        </w:tc>
+        <w:tc>
+          <w:tcPr>
+            <w:tcW w:type="dxa" w:w="2016"/>
+            <w:tcBorders>
+              <w:top w:val="single" w:sz="4" w:color="AAAAAA"/>
+              <w:left w:val="single" w:sz="4" w:color="AAAAAA"/>
+              <w:bottom w:val="single" w:sz="4" w:color="AAAAAA"/>
+              <w:right w:val="single" w:sz="4" w:color="AAAAAA"/>
+            </w:tcBorders>
+          </w:tcPr>
+          <w:p>
+            <w:pPr>
+              <w:jc w:val="left"/>
+            </w:pPr>
+            <w:r/>
+            <w:r>
+              <w:rPr>
+                <w:sz w:val="18"/>
+              </w:rPr>
+              <w:t>21 de mayo de 2026</w:t>
+            </w:r>
+          </w:p>
+        </w:tc>
+        <w:tc>
+          <w:tcPr>
+            <w:tcW w:type="dxa" w:w="5040"/>
+            <w:tcBorders>
+              <w:top w:val="single" w:sz="4" w:color="AAAAAA"/>
+              <w:left w:val="single" w:sz="4" w:color="AAAAAA"/>
+              <w:bottom w:val="single" w:sz="4" w:color="AAAAAA"/>
+              <w:right w:val="single" w:sz="4" w:color="AAAAAA"/>
+            </w:tcBorders>
+          </w:tcPr>
+          <w:p>
+            <w:pPr>
+              <w:jc w:val="left"/>
+            </w:pPr>
+            <w:r/>
+            <w:r>
+              <w:rPr>
+                <w:sz w:val="18"/>
+              </w:rPr>
+              <w:t>Reorientación de objetivos específicos OE1–OE7: de entregables técnicos a capacidades de gobernanza.</w:t>
+            </w:r>
+          </w:p>
+        </w:tc>
+        <w:tc>
+          <w:tcPr>
+            <w:tcW w:type="dxa" w:w="2016"/>
+            <w:tcBorders>
+              <w:top w:val="single" w:sz="4" w:color="AAAAAA"/>
+              <w:left w:val="single" w:sz="4" w:color="AAAAAA"/>
+              <w:bottom w:val="single" w:sz="4" w:color="AAAAAA"/>
+              <w:right w:val="single" w:sz="4" w:color="AAAAAA"/>
+            </w:tcBorders>
+          </w:tcPr>
+          <w:p>
+            <w:pPr>
+              <w:jc w:val="left"/>
+            </w:pPr>
+            <w:r>
+              <w:rPr>
+                <w:sz w:val="18"/>
+              </w:rPr>
+            </w:r>
+            <w:r>
+              <w:t>Alberto Sanchez</w:t>
+            </w:r>
+            <w:r>
+              <w:br/>
+            </w:r>
+            <w:r>
+              <w:t>David Urquizo</w:t>
+            </w:r>
+          </w:p>
+        </w:tc>
+      </w:tr>
+    </w:tbl>
+    <w:p/>
     <w:p>
       <w:r>
         <w:br w:type="page"/>

</xml_diff>